<commit_message>
Removing unneeded variables in .h file
</commit_message>
<xml_diff>
--- a/RW25CompletedCodeAndSystemManual/SystemManual25-26.docx
+++ b/RW25CompletedCodeAndSystemManual/SystemManual25-26.docx
@@ -88,18 +88,14 @@
         <w:t>(Maximum 1 page)</w:t>
       </w:r>
     </w:p>
-    <w:p/>
-    <w:p>
-      <w:pPr>
-        <w:pStyle w:val="Heading1"/>
-      </w:pPr>
-      <w:r>
-        <w:t>Project Files</w:t>
-      </w:r>
-    </w:p>
-    <w:p>
-      <w:r>
-        <w:t>(Maximum 1 page)</w:t>
+    <w:p>
+      <w:r>
+        <w:t>(What the problem is and what the programme should be doing)</w:t>
+      </w:r>
+    </w:p>
+    <w:p>
+      <w:r>
+        <w:t>(Summarise the project brief)</w:t>
       </w:r>
     </w:p>
     <w:p/>
@@ -126,12 +122,563 @@
     <w:p/>
     <w:p/>
     <w:p/>
+    <w:p/>
+    <w:p/>
     <w:p>
       <w:pPr>
         <w:pStyle w:val="Heading1"/>
-      </w:pPr>
-      <w:r>
+        <w:rPr>
+          <w:b/>
+          <w:bCs/>
+        </w:rPr>
+      </w:pPr>
+      <w:r>
+        <w:rPr>
+          <w:b/>
+          <w:bCs/>
+        </w:rPr>
         <w:lastRenderedPageBreak/>
+        <w:t>Project Files</w:t>
+      </w:r>
+      <w:r>
+        <w:rPr>
+          <w:b/>
+          <w:bCs/>
+        </w:rPr>
+        <w:t xml:space="preserve"> MAX ONE PAGE</w:t>
+      </w:r>
+    </w:p>
+    <w:p>
+      <w:pPr>
+        <w:rPr>
+          <w:color w:val="007BB8"/>
+        </w:rPr>
+      </w:pPr>
+    </w:p>
+    <w:p>
+      <w:pPr>
+        <w:rPr>
+          <w:b/>
+          <w:bCs/>
+          <w:color w:val="004F88"/>
+          <w:sz w:val="20"/>
+        </w:rPr>
+      </w:pPr>
+      <w:r>
+        <w:rPr>
+          <w:b/>
+          <w:bCs/>
+          <w:color w:val="004F88"/>
+          <w:sz w:val="20"/>
+        </w:rPr>
+        <w:t>RW25CodeTestFileAndPlanning</w:t>
+      </w:r>
+      <w:r>
+        <w:rPr>
+          <w:b/>
+          <w:bCs/>
+          <w:color w:val="004F88"/>
+          <w:sz w:val="20"/>
+        </w:rPr>
+        <w:t xml:space="preserve"> &gt; </w:t>
+      </w:r>
+      <w:proofErr w:type="spellStart"/>
+      <w:r>
+        <w:rPr>
+          <w:b/>
+          <w:bCs/>
+          <w:color w:val="004F88"/>
+          <w:sz w:val="20"/>
+        </w:rPr>
+        <w:t>RobotCodingFile</w:t>
+      </w:r>
+      <w:proofErr w:type="spellEnd"/>
+      <w:r>
+        <w:rPr>
+          <w:b/>
+          <w:bCs/>
+          <w:color w:val="004F88"/>
+          <w:sz w:val="20"/>
+        </w:rPr>
+        <w:t>:</w:t>
+      </w:r>
+    </w:p>
+    <w:p>
+      <w:pPr>
+        <w:rPr>
+          <w:color w:val="000000" w:themeColor="text1"/>
+          <w:sz w:val="20"/>
+        </w:rPr>
+      </w:pPr>
+      <w:proofErr w:type="spellStart"/>
+      <w:r>
+        <w:rPr>
+          <w:b/>
+          <w:bCs/>
+          <w:color w:val="000000" w:themeColor="text1"/>
+          <w:sz w:val="20"/>
+        </w:rPr>
+        <w:t>IntialCodeForDrawingRobot.c</w:t>
+      </w:r>
+      <w:proofErr w:type="spellEnd"/>
+      <w:r>
+        <w:rPr>
+          <w:b/>
+          <w:bCs/>
+          <w:color w:val="000000" w:themeColor="text1"/>
+          <w:sz w:val="20"/>
+        </w:rPr>
+        <w:t xml:space="preserve">: </w:t>
+      </w:r>
+      <w:r>
+        <w:rPr>
+          <w:color w:val="000000" w:themeColor="text1"/>
+          <w:sz w:val="20"/>
+        </w:rPr>
+        <w:t>Contains my first code for the project and this is where I developed most of my functions. The other files below contain the refined and corrected code.</w:t>
+      </w:r>
+    </w:p>
+    <w:p>
+      <w:pPr>
+        <w:rPr>
+          <w:color w:val="000000" w:themeColor="text1"/>
+          <w:sz w:val="20"/>
+        </w:rPr>
+      </w:pPr>
+    </w:p>
+    <w:p>
+      <w:pPr>
+        <w:rPr>
+          <w:b/>
+          <w:bCs/>
+          <w:color w:val="004F88"/>
+          <w:sz w:val="20"/>
+        </w:rPr>
+      </w:pPr>
+      <w:r>
+        <w:rPr>
+          <w:b/>
+          <w:bCs/>
+          <w:color w:val="004F88"/>
+          <w:sz w:val="20"/>
+        </w:rPr>
+        <w:t>RW25</w:t>
+      </w:r>
+      <w:r>
+        <w:rPr>
+          <w:b/>
+          <w:bCs/>
+          <w:color w:val="004F88"/>
+          <w:sz w:val="20"/>
+        </w:rPr>
+        <w:t>CompletedCodeAndSystemManual</w:t>
+      </w:r>
+      <w:r>
+        <w:rPr>
+          <w:b/>
+          <w:bCs/>
+          <w:color w:val="004F88"/>
+          <w:sz w:val="20"/>
+        </w:rPr>
+        <w:t xml:space="preserve"> &gt; Robot</w:t>
+      </w:r>
+      <w:r>
+        <w:rPr>
+          <w:b/>
+          <w:bCs/>
+          <w:color w:val="004F88"/>
+          <w:sz w:val="20"/>
+        </w:rPr>
+        <w:t xml:space="preserve">Writer2025 &gt; </w:t>
+      </w:r>
+      <w:r>
+        <w:rPr>
+          <w:b/>
+          <w:bCs/>
+          <w:color w:val="004F88"/>
+          <w:sz w:val="20"/>
+        </w:rPr>
+        <w:t>RobotWriter2025</w:t>
+      </w:r>
+      <w:r>
+        <w:rPr>
+          <w:b/>
+          <w:bCs/>
+          <w:color w:val="004F88"/>
+          <w:sz w:val="20"/>
+        </w:rPr>
+        <w:t>FinalCode</w:t>
+      </w:r>
+      <w:r>
+        <w:rPr>
+          <w:b/>
+          <w:bCs/>
+          <w:color w:val="004F88"/>
+          <w:sz w:val="20"/>
+        </w:rPr>
+        <w:t>:</w:t>
+      </w:r>
+    </w:p>
+    <w:p>
+      <w:pPr>
+        <w:rPr>
+          <w:b/>
+          <w:bCs/>
+          <w:color w:val="000000" w:themeColor="text1"/>
+          <w:sz w:val="20"/>
+        </w:rPr>
+      </w:pPr>
+      <w:proofErr w:type="spellStart"/>
+      <w:r>
+        <w:rPr>
+          <w:b/>
+          <w:bCs/>
+          <w:color w:val="000000" w:themeColor="text1"/>
+          <w:sz w:val="20"/>
+        </w:rPr>
+        <w:t>CheckingWordAndGCodeCommands</w:t>
+      </w:r>
+      <w:r>
+        <w:rPr>
+          <w:b/>
+          <w:bCs/>
+          <w:color w:val="000000" w:themeColor="text1"/>
+          <w:sz w:val="20"/>
+        </w:rPr>
+        <w:t>.c</w:t>
+      </w:r>
+      <w:proofErr w:type="spellEnd"/>
+      <w:r>
+        <w:rPr>
+          <w:b/>
+          <w:bCs/>
+          <w:color w:val="000000" w:themeColor="text1"/>
+          <w:sz w:val="20"/>
+        </w:rPr>
+        <w:t>:</w:t>
+      </w:r>
+      <w:r>
+        <w:rPr>
+          <w:b/>
+          <w:bCs/>
+          <w:color w:val="000000" w:themeColor="text1"/>
+          <w:sz w:val="20"/>
+        </w:rPr>
+        <w:t xml:space="preserve"> At the top of this file it contains the definitions for all my global variables </w:t>
+      </w:r>
+    </w:p>
+    <w:p>
+      <w:pPr>
+        <w:rPr>
+          <w:b/>
+          <w:bCs/>
+          <w:color w:val="000000" w:themeColor="text1"/>
+          <w:sz w:val="20"/>
+        </w:rPr>
+      </w:pPr>
+      <w:proofErr w:type="spellStart"/>
+      <w:r>
+        <w:rPr>
+          <w:b/>
+          <w:bCs/>
+          <w:color w:val="000000" w:themeColor="text1"/>
+          <w:sz w:val="20"/>
+        </w:rPr>
+        <w:t>CheckingWordAndGCodeCommands.</w:t>
+      </w:r>
+      <w:r>
+        <w:rPr>
+          <w:b/>
+          <w:bCs/>
+          <w:color w:val="000000" w:themeColor="text1"/>
+          <w:sz w:val="20"/>
+        </w:rPr>
+        <w:t>h</w:t>
+      </w:r>
+      <w:proofErr w:type="spellEnd"/>
+      <w:r>
+        <w:rPr>
+          <w:b/>
+          <w:bCs/>
+          <w:color w:val="000000" w:themeColor="text1"/>
+          <w:sz w:val="20"/>
+        </w:rPr>
+        <w:t>:</w:t>
+      </w:r>
+    </w:p>
+    <w:p>
+      <w:pPr>
+        <w:rPr>
+          <w:b/>
+          <w:bCs/>
+          <w:color w:val="000000" w:themeColor="text1"/>
+          <w:sz w:val="20"/>
+        </w:rPr>
+      </w:pPr>
+      <w:proofErr w:type="spellStart"/>
+      <w:r>
+        <w:rPr>
+          <w:b/>
+          <w:bCs/>
+          <w:color w:val="000000" w:themeColor="text1"/>
+          <w:sz w:val="20"/>
+        </w:rPr>
+        <w:t>LoadingDaraStructs.c</w:t>
+      </w:r>
+      <w:proofErr w:type="spellEnd"/>
+      <w:r>
+        <w:rPr>
+          <w:b/>
+          <w:bCs/>
+          <w:color w:val="000000" w:themeColor="text1"/>
+          <w:sz w:val="20"/>
+        </w:rPr>
+        <w:t>:</w:t>
+      </w:r>
+    </w:p>
+    <w:p>
+      <w:pPr>
+        <w:rPr>
+          <w:b/>
+          <w:bCs/>
+          <w:color w:val="000000" w:themeColor="text1"/>
+          <w:sz w:val="20"/>
+        </w:rPr>
+      </w:pPr>
+      <w:proofErr w:type="spellStart"/>
+      <w:r>
+        <w:rPr>
+          <w:b/>
+          <w:bCs/>
+          <w:color w:val="000000" w:themeColor="text1"/>
+          <w:sz w:val="20"/>
+        </w:rPr>
+        <w:t>LoadingDaraStructs.c</w:t>
+      </w:r>
+      <w:proofErr w:type="spellEnd"/>
+      <w:r>
+        <w:rPr>
+          <w:b/>
+          <w:bCs/>
+          <w:color w:val="000000" w:themeColor="text1"/>
+          <w:sz w:val="20"/>
+        </w:rPr>
+        <w:t>:</w:t>
+      </w:r>
+    </w:p>
+    <w:p>
+      <w:pPr>
+        <w:rPr>
+          <w:b/>
+          <w:bCs/>
+          <w:color w:val="000000" w:themeColor="text1"/>
+          <w:sz w:val="20"/>
+        </w:rPr>
+      </w:pPr>
+      <w:proofErr w:type="spellStart"/>
+      <w:r>
+        <w:rPr>
+          <w:b/>
+          <w:bCs/>
+          <w:color w:val="000000" w:themeColor="text1"/>
+          <w:sz w:val="20"/>
+        </w:rPr>
+        <w:t>main.c</w:t>
+      </w:r>
+      <w:proofErr w:type="spellEnd"/>
+      <w:r>
+        <w:rPr>
+          <w:b/>
+          <w:bCs/>
+          <w:color w:val="000000" w:themeColor="text1"/>
+          <w:sz w:val="20"/>
+        </w:rPr>
+        <w:t>:</w:t>
+      </w:r>
+    </w:p>
+    <w:p>
+      <w:pPr>
+        <w:rPr>
+          <w:b/>
+          <w:bCs/>
+          <w:color w:val="000000" w:themeColor="text1"/>
+          <w:sz w:val="20"/>
+        </w:rPr>
+      </w:pPr>
+      <w:proofErr w:type="spellStart"/>
+      <w:r>
+        <w:rPr>
+          <w:b/>
+          <w:bCs/>
+          <w:color w:val="000000" w:themeColor="text1"/>
+          <w:sz w:val="20"/>
+        </w:rPr>
+        <w:t>main.h</w:t>
+      </w:r>
+      <w:proofErr w:type="spellEnd"/>
+      <w:r>
+        <w:rPr>
+          <w:b/>
+          <w:bCs/>
+          <w:color w:val="000000" w:themeColor="text1"/>
+          <w:sz w:val="20"/>
+        </w:rPr>
+        <w:t>:</w:t>
+      </w:r>
+    </w:p>
+    <w:p>
+      <w:pPr>
+        <w:rPr>
+          <w:b/>
+          <w:bCs/>
+          <w:color w:val="000000" w:themeColor="text1"/>
+          <w:sz w:val="20"/>
+        </w:rPr>
+      </w:pPr>
+      <w:r>
+        <w:rPr>
+          <w:b/>
+          <w:bCs/>
+          <w:color w:val="000000" w:themeColor="text1"/>
+          <w:sz w:val="20"/>
+        </w:rPr>
+        <w:t>SampleLines.txt</w:t>
+      </w:r>
+      <w:r>
+        <w:rPr>
+          <w:b/>
+          <w:bCs/>
+          <w:color w:val="000000" w:themeColor="text1"/>
+          <w:sz w:val="20"/>
+        </w:rPr>
+        <w:t xml:space="preserve">: </w:t>
+      </w:r>
+      <w:r>
+        <w:rPr>
+          <w:color w:val="000000" w:themeColor="text1"/>
+          <w:sz w:val="20"/>
+        </w:rPr>
+        <w:t>Text file that contains the sentence(s) that the user wants to draw</w:t>
+      </w:r>
+    </w:p>
+    <w:p>
+      <w:pPr>
+        <w:rPr>
+          <w:b/>
+          <w:bCs/>
+          <w:color w:val="000000" w:themeColor="text1"/>
+          <w:sz w:val="20"/>
+        </w:rPr>
+      </w:pPr>
+      <w:proofErr w:type="spellStart"/>
+      <w:r>
+        <w:rPr>
+          <w:b/>
+          <w:bCs/>
+          <w:color w:val="000000" w:themeColor="text1"/>
+          <w:sz w:val="20"/>
+        </w:rPr>
+        <w:t>SingleStrokeFont</w:t>
+      </w:r>
+      <w:proofErr w:type="spellEnd"/>
+      <w:r>
+        <w:rPr>
+          <w:b/>
+          <w:bCs/>
+          <w:color w:val="000000" w:themeColor="text1"/>
+          <w:sz w:val="20"/>
+        </w:rPr>
+        <w:t>:</w:t>
+      </w:r>
+      <w:r>
+        <w:rPr>
+          <w:b/>
+          <w:bCs/>
+          <w:color w:val="000000" w:themeColor="text1"/>
+          <w:sz w:val="20"/>
+        </w:rPr>
+        <w:t xml:space="preserve"> </w:t>
+      </w:r>
+      <w:r>
+        <w:rPr>
+          <w:color w:val="000000" w:themeColor="text1"/>
+          <w:sz w:val="20"/>
+        </w:rPr>
+        <w:t>Text file that contains all the stroke data for each of the 128 ascii characters</w:t>
+      </w:r>
+    </w:p>
+    <w:p>
+      <w:pPr>
+        <w:rPr>
+          <w:b/>
+          <w:bCs/>
+          <w:color w:val="004F88"/>
+        </w:rPr>
+      </w:pPr>
+    </w:p>
+    <w:p>
+      <w:pPr>
+        <w:rPr>
+          <w:b/>
+          <w:bCs/>
+          <w:color w:val="004F88"/>
+        </w:rPr>
+      </w:pPr>
+    </w:p>
+    <w:p>
+      <w:pPr>
+        <w:rPr>
+          <w:color w:val="000000" w:themeColor="text1"/>
+        </w:rPr>
+      </w:pPr>
+    </w:p>
+    <w:p/>
+    <w:p>
+      <w:r>
+        <w:t>(.h and .c)</w:t>
+      </w:r>
+    </w:p>
+    <w:p>
+      <w:r>
+        <w:t xml:space="preserve">(Explain about the </w:t>
+      </w:r>
+      <w:proofErr w:type="spellStart"/>
+      <w:r>
+        <w:t>defintions</w:t>
+      </w:r>
+      <w:proofErr w:type="spellEnd"/>
+      <w:r>
+        <w:t xml:space="preserve"> in each .h file and why it’s</w:t>
+      </w:r>
+    </w:p>
+    <w:p/>
+    <w:p/>
+    <w:p/>
+    <w:p/>
+    <w:p/>
+    <w:p/>
+    <w:p/>
+    <w:p/>
+    <w:p/>
+    <w:p/>
+    <w:p/>
+    <w:p/>
+    <w:p/>
+    <w:p/>
+    <w:p/>
+    <w:p/>
+    <w:p/>
+    <w:p/>
+    <w:p/>
+    <w:p/>
+    <w:p/>
+    <w:p/>
+    <w:p/>
+    <w:p>
+      <w:pPr>
+        <w:pStyle w:val="Heading1"/>
+      </w:pPr>
+      <w:r>
         <w:t>Key Data Items</w:t>
       </w:r>
     </w:p>
@@ -2069,6 +2616,7 @@
                 <w:bCs/>
                 <w:sz w:val="20"/>
               </w:rPr>
+              <w:lastRenderedPageBreak/>
               <w:t>*</w:t>
             </w:r>
             <w:proofErr w:type="spellStart"/>
@@ -2315,18 +2863,11 @@
         </w:tc>
       </w:tr>
     </w:tbl>
-    <w:p/>
-    <w:p>
-      <w:r>
-        <w:t>Extend table as required</w:t>
-      </w:r>
-    </w:p>
     <w:p>
       <w:pPr>
         <w:pStyle w:val="Heading1"/>
       </w:pPr>
       <w:r>
-        <w:lastRenderedPageBreak/>
         <w:t>Function</w:t>
       </w:r>
       <w:r>
@@ -2817,6 +3358,7 @@
           <w:iCs/>
           <w:color w:val="EE0000"/>
         </w:rPr>
+        <w:lastRenderedPageBreak/>
         <w:t>Ou</w:t>
       </w:r>
       <w:r>
@@ -2927,7 +3469,6 @@
           <w:sz w:val="36"/>
           <w:szCs w:val="36"/>
         </w:rPr>
-        <w:lastRenderedPageBreak/>
         <w:t>Testing Information</w:t>
       </w:r>
       <w:r>
@@ -2992,8 +3533,8 @@
       </w:tblPr>
       <w:tblGrid>
         <w:gridCol w:w="1696"/>
-        <w:gridCol w:w="1985"/>
-        <w:gridCol w:w="2410"/>
+        <w:gridCol w:w="2127"/>
+        <w:gridCol w:w="2268"/>
         <w:gridCol w:w="2925"/>
       </w:tblGrid>
       <w:tr>
@@ -3012,7 +3553,7 @@
         </w:tc>
         <w:tc>
           <w:tcPr>
-            <w:tcW w:w="1985" w:type="dxa"/>
+            <w:tcW w:w="2127" w:type="dxa"/>
           </w:tcPr>
           <w:p>
             <w:pPr>
@@ -3025,7 +3566,7 @@
         </w:tc>
         <w:tc>
           <w:tcPr>
-            <w:tcW w:w="2410" w:type="dxa"/>
+            <w:tcW w:w="2268" w:type="dxa"/>
           </w:tcPr>
           <w:p>
             <w:pPr>
@@ -3073,6 +3614,7 @@
                 <w:szCs w:val="18"/>
               </w:rPr>
             </w:pPr>
+            <w:proofErr w:type="spellStart"/>
             <w:r>
               <w:rPr>
                 <w:b/>
@@ -3080,13 +3622,23 @@
                 <w:sz w:val="20"/>
                 <w:szCs w:val="18"/>
               </w:rPr>
-              <w:t>LoadData()</w:t>
-            </w:r>
-          </w:p>
-        </w:tc>
-        <w:tc>
-          <w:tcPr>
-            <w:tcW w:w="1985" w:type="dxa"/>
+              <w:t>LoadData</w:t>
+            </w:r>
+            <w:proofErr w:type="spellEnd"/>
+            <w:r>
+              <w:rPr>
+                <w:b/>
+                <w:bCs/>
+                <w:sz w:val="20"/>
+                <w:szCs w:val="18"/>
+              </w:rPr>
+              <w:t>()</w:t>
+            </w:r>
+          </w:p>
+        </w:tc>
+        <w:tc>
+          <w:tcPr>
+            <w:tcW w:w="2127" w:type="dxa"/>
           </w:tcPr>
           <w:p>
             <w:pPr>
@@ -3213,37 +3765,27 @@
         </w:tc>
         <w:tc>
           <w:tcPr>
-            <w:tcW w:w="2410" w:type="dxa"/>
-          </w:tcPr>
-          <w:p>
-            <w:pPr>
-              <w:rPr>
-                <w:b/>
-                <w:bCs/>
-                <w:color w:val="388600"/>
-                <w:sz w:val="16"/>
-                <w:szCs w:val="16"/>
-              </w:rPr>
-            </w:pPr>
-            <w:r>
-              <w:rPr>
-                <w:b/>
-                <w:bCs/>
-                <w:color w:val="388600"/>
-                <w:sz w:val="16"/>
-                <w:szCs w:val="16"/>
-              </w:rPr>
-              <w:t>Use the correct “SingleStrokeFont.txt” file</w:t>
-            </w:r>
-            <w:r>
-              <w:rPr>
-                <w:b/>
-                <w:bCs/>
-                <w:color w:val="388600"/>
-                <w:sz w:val="16"/>
-                <w:szCs w:val="16"/>
-              </w:rPr>
-              <w:t xml:space="preserve"> containing all the right characters</w:t>
+            <w:tcW w:w="2268" w:type="dxa"/>
+          </w:tcPr>
+          <w:p>
+            <w:pPr>
+              <w:rPr>
+                <w:b/>
+                <w:bCs/>
+                <w:color w:val="388600"/>
+                <w:sz w:val="16"/>
+                <w:szCs w:val="16"/>
+              </w:rPr>
+            </w:pPr>
+            <w:r>
+              <w:rPr>
+                <w:b/>
+                <w:bCs/>
+                <w:color w:val="388600"/>
+                <w:sz w:val="16"/>
+                <w:szCs w:val="16"/>
+              </w:rPr>
+              <w:t>Use the correct “SingleStrokeFont.txt” file containing all the right characters</w:t>
             </w:r>
           </w:p>
           <w:p>
@@ -3507,20 +4049,20 @@
         </w:tc>
         <w:tc>
           <w:tcPr>
-            <w:tcW w:w="1985" w:type="dxa"/>
-          </w:tcPr>
-          <w:p>
-            <w:pPr>
-              <w:rPr>
-                <w:sz w:val="16"/>
-                <w:szCs w:val="16"/>
-              </w:rPr>
-            </w:pPr>
-          </w:p>
-        </w:tc>
-        <w:tc>
-          <w:tcPr>
-            <w:tcW w:w="2410" w:type="dxa"/>
+            <w:tcW w:w="2127" w:type="dxa"/>
+          </w:tcPr>
+          <w:p>
+            <w:pPr>
+              <w:rPr>
+                <w:sz w:val="16"/>
+                <w:szCs w:val="16"/>
+              </w:rPr>
+            </w:pPr>
+          </w:p>
+        </w:tc>
+        <w:tc>
+          <w:tcPr>
+            <w:tcW w:w="2268" w:type="dxa"/>
           </w:tcPr>
           <w:p>
             <w:pPr>
@@ -3562,6 +4104,7 @@
                 <w:szCs w:val="18"/>
               </w:rPr>
             </w:pPr>
+            <w:proofErr w:type="spellStart"/>
             <w:r>
               <w:rPr>
                 <w:b/>
@@ -3569,23 +4112,33 @@
                 <w:sz w:val="20"/>
                 <w:szCs w:val="18"/>
               </w:rPr>
-              <w:t>FontSize()</w:t>
-            </w:r>
-          </w:p>
-          <w:p>
-            <w:pPr>
+              <w:t>FontSize</w:t>
+            </w:r>
+            <w:proofErr w:type="spellEnd"/>
+            <w:r>
               <w:rPr>
                 <w:b/>
                 <w:bCs/>
                 <w:sz w:val="20"/>
                 <w:szCs w:val="18"/>
               </w:rPr>
-            </w:pPr>
-          </w:p>
-        </w:tc>
-        <w:tc>
-          <w:tcPr>
-            <w:tcW w:w="1985" w:type="dxa"/>
+              <w:t>()</w:t>
+            </w:r>
+          </w:p>
+          <w:p>
+            <w:pPr>
+              <w:rPr>
+                <w:b/>
+                <w:bCs/>
+                <w:sz w:val="20"/>
+                <w:szCs w:val="18"/>
+              </w:rPr>
+            </w:pPr>
+          </w:p>
+        </w:tc>
+        <w:tc>
+          <w:tcPr>
+            <w:tcW w:w="2127" w:type="dxa"/>
           </w:tcPr>
           <w:p>
             <w:pPr>
@@ -3675,7 +4228,7 @@
         </w:tc>
         <w:tc>
           <w:tcPr>
-            <w:tcW w:w="2410" w:type="dxa"/>
+            <w:tcW w:w="2268" w:type="dxa"/>
           </w:tcPr>
           <w:p>
             <w:pPr>
@@ -3914,6 +4467,7 @@
                 <w:szCs w:val="18"/>
               </w:rPr>
             </w:pPr>
+            <w:proofErr w:type="spellStart"/>
             <w:r>
               <w:rPr>
                 <w:b/>
@@ -3921,13 +4475,23 @@
                 <w:sz w:val="20"/>
                 <w:szCs w:val="18"/>
               </w:rPr>
-              <w:t>ReadNextWord()</w:t>
-            </w:r>
-          </w:p>
-        </w:tc>
-        <w:tc>
-          <w:tcPr>
-            <w:tcW w:w="1985" w:type="dxa"/>
+              <w:t>ReadNextWord</w:t>
+            </w:r>
+            <w:proofErr w:type="spellEnd"/>
+            <w:r>
+              <w:rPr>
+                <w:b/>
+                <w:bCs/>
+                <w:sz w:val="20"/>
+                <w:szCs w:val="18"/>
+              </w:rPr>
+              <w:t>()</w:t>
+            </w:r>
+          </w:p>
+        </w:tc>
+        <w:tc>
+          <w:tcPr>
+            <w:tcW w:w="2127" w:type="dxa"/>
           </w:tcPr>
           <w:p>
             <w:pPr>
@@ -3978,17 +4542,7 @@
                 <w:sz w:val="16"/>
                 <w:szCs w:val="16"/>
               </w:rPr>
-              <w:t>Test using correct “Sample</w:t>
-            </w:r>
-            <w:r>
-              <w:rPr>
-                <w:b/>
-                <w:bCs/>
-                <w:color w:val="388600"/>
-                <w:sz w:val="16"/>
-                <w:szCs w:val="16"/>
-              </w:rPr>
-              <w:t>Lines.txt” file</w:t>
+              <w:t>Test using correct “SampleLines.txt” file</w:t>
             </w:r>
           </w:p>
           <w:p>
@@ -4026,7 +4580,7 @@
         </w:tc>
         <w:tc>
           <w:tcPr>
-            <w:tcW w:w="2410" w:type="dxa"/>
+            <w:tcW w:w="2268" w:type="dxa"/>
           </w:tcPr>
           <w:p>
             <w:pPr>
@@ -4077,37 +4631,7 @@
                 <w:sz w:val="16"/>
                 <w:szCs w:val="16"/>
               </w:rPr>
-              <w:t>Add</w:t>
-            </w:r>
-            <w:r>
-              <w:rPr>
-                <w:b/>
-                <w:bCs/>
-                <w:color w:val="388600"/>
-                <w:sz w:val="16"/>
-                <w:szCs w:val="16"/>
-              </w:rPr>
-              <w:t xml:space="preserve"> “SampleLines.txt” </w:t>
-            </w:r>
-            <w:r>
-              <w:rPr>
-                <w:b/>
-                <w:bCs/>
-                <w:color w:val="388600"/>
-                <w:sz w:val="16"/>
-                <w:szCs w:val="16"/>
-              </w:rPr>
-              <w:t xml:space="preserve">to </w:t>
-            </w:r>
-            <w:r>
-              <w:rPr>
-                <w:b/>
-                <w:bCs/>
-                <w:color w:val="388600"/>
-                <w:sz w:val="16"/>
-                <w:szCs w:val="16"/>
-              </w:rPr>
-              <w:t xml:space="preserve">Robot writer folder </w:t>
+              <w:t xml:space="preserve">Add “SampleLines.txt” to Robot writer folder </w:t>
             </w:r>
           </w:p>
           <w:p>
@@ -4248,6 +4772,7 @@
                 <w:szCs w:val="18"/>
               </w:rPr>
             </w:pPr>
+            <w:proofErr w:type="spellStart"/>
             <w:r>
               <w:rPr>
                 <w:b/>
@@ -4257,6 +4782,7 @@
               </w:rPr>
               <w:t>WordLength</w:t>
             </w:r>
+            <w:proofErr w:type="spellEnd"/>
             <w:r>
               <w:rPr>
                 <w:b/>
@@ -4270,8 +4796,40 @@
         </w:tc>
         <w:tc>
           <w:tcPr>
-            <w:tcW w:w="1985" w:type="dxa"/>
-          </w:tcPr>
+            <w:tcW w:w="2127" w:type="dxa"/>
+          </w:tcPr>
+          <w:p>
+            <w:pPr>
+              <w:rPr>
+                <w:b/>
+                <w:bCs/>
+                <w:color w:val="EE0000"/>
+                <w:sz w:val="16"/>
+                <w:szCs w:val="16"/>
+              </w:rPr>
+            </w:pPr>
+            <w:r>
+              <w:rPr>
+                <w:b/>
+                <w:bCs/>
+                <w:color w:val="EE0000"/>
+                <w:sz w:val="16"/>
+                <w:szCs w:val="16"/>
+              </w:rPr>
+              <w:t>Test using a word that will be longer than 100mm on the page</w:t>
+            </w:r>
+          </w:p>
+          <w:p>
+            <w:pPr>
+              <w:rPr>
+                <w:b/>
+                <w:bCs/>
+                <w:color w:val="388600"/>
+                <w:sz w:val="16"/>
+                <w:szCs w:val="16"/>
+              </w:rPr>
+            </w:pPr>
+          </w:p>
           <w:p>
             <w:pPr>
               <w:rPr>
@@ -4377,8 +4935,40 @@
         </w:tc>
         <w:tc>
           <w:tcPr>
-            <w:tcW w:w="2410" w:type="dxa"/>
-          </w:tcPr>
+            <w:tcW w:w="2268" w:type="dxa"/>
+          </w:tcPr>
+          <w:p>
+            <w:pPr>
+              <w:rPr>
+                <w:b/>
+                <w:bCs/>
+                <w:color w:val="EE0000"/>
+                <w:sz w:val="16"/>
+                <w:szCs w:val="16"/>
+              </w:rPr>
+            </w:pPr>
+            <w:r>
+              <w:rPr>
+                <w:b/>
+                <w:bCs/>
+                <w:color w:val="EE0000"/>
+                <w:sz w:val="16"/>
+                <w:szCs w:val="16"/>
+              </w:rPr>
+              <w:t>“HHHHHHHHHHHHHHHHHH” (Font Size 10)</w:t>
+            </w:r>
+          </w:p>
+          <w:p>
+            <w:pPr>
+              <w:rPr>
+                <w:b/>
+                <w:bCs/>
+                <w:color w:val="388600"/>
+                <w:sz w:val="16"/>
+                <w:szCs w:val="16"/>
+              </w:rPr>
+            </w:pPr>
+          </w:p>
           <w:p>
             <w:pPr>
               <w:rPr>
@@ -4455,6 +5045,38 @@
           <w:tcPr>
             <w:tcW w:w="2925" w:type="dxa"/>
           </w:tcPr>
+          <w:p>
+            <w:pPr>
+              <w:rPr>
+                <w:b/>
+                <w:bCs/>
+                <w:color w:val="EE0000"/>
+                <w:sz w:val="16"/>
+                <w:szCs w:val="16"/>
+              </w:rPr>
+            </w:pPr>
+            <w:r>
+              <w:rPr>
+                <w:b/>
+                <w:bCs/>
+                <w:color w:val="EE0000"/>
+                <w:sz w:val="16"/>
+                <w:szCs w:val="16"/>
+              </w:rPr>
+              <w:t>Tell user the next word that is about to be drawn is too long to fit on the page</w:t>
+            </w:r>
+          </w:p>
+          <w:p>
+            <w:pPr>
+              <w:rPr>
+                <w:b/>
+                <w:bCs/>
+                <w:color w:val="388600"/>
+                <w:sz w:val="16"/>
+                <w:szCs w:val="16"/>
+              </w:rPr>
+            </w:pPr>
+          </w:p>
           <w:p>
             <w:pPr>
               <w:rPr>
@@ -4567,6 +5189,7 @@
                 <w:szCs w:val="18"/>
               </w:rPr>
             </w:pPr>
+            <w:proofErr w:type="spellStart"/>
             <w:r>
               <w:rPr>
                 <w:b/>
@@ -4574,13 +5197,23 @@
                 <w:sz w:val="20"/>
                 <w:szCs w:val="18"/>
               </w:rPr>
-              <w:t>SetNewLine()</w:t>
-            </w:r>
-          </w:p>
-        </w:tc>
-        <w:tc>
-          <w:tcPr>
-            <w:tcW w:w="1985" w:type="dxa"/>
+              <w:t>SetNewLine</w:t>
+            </w:r>
+            <w:proofErr w:type="spellEnd"/>
+            <w:r>
+              <w:rPr>
+                <w:b/>
+                <w:bCs/>
+                <w:sz w:val="20"/>
+                <w:szCs w:val="18"/>
+              </w:rPr>
+              <w:t>()</w:t>
+            </w:r>
+          </w:p>
+        </w:tc>
+        <w:tc>
+          <w:tcPr>
+            <w:tcW w:w="2127" w:type="dxa"/>
           </w:tcPr>
           <w:p>
             <w:pPr>
@@ -4606,7 +5239,7 @@
         </w:tc>
         <w:tc>
           <w:tcPr>
-            <w:tcW w:w="2410" w:type="dxa"/>
+            <w:tcW w:w="2268" w:type="dxa"/>
           </w:tcPr>
           <w:p>
             <w:pPr>
@@ -4705,7 +5338,17 @@
                 <w:sz w:val="16"/>
                 <w:szCs w:val="16"/>
               </w:rPr>
-              <w:t xml:space="preserve">The robot should go down by a new line each time it reads a new line in the file (\n) and should start drawing the new line -10 mm lower. Also the </w:t>
+              <w:t xml:space="preserve">This function should cause an output in send commands </w:t>
+            </w:r>
+            <w:r>
+              <w:rPr>
+                <w:b/>
+                <w:bCs/>
+                <w:color w:val="388600"/>
+                <w:sz w:val="16"/>
+                <w:szCs w:val="16"/>
+              </w:rPr>
+              <w:t xml:space="preserve">after </w:t>
             </w:r>
             <w:proofErr w:type="spellStart"/>
             <w:r>
@@ -4716,7 +5359,7 @@
                 <w:sz w:val="16"/>
                 <w:szCs w:val="16"/>
               </w:rPr>
-              <w:t>GCode</w:t>
+              <w:t>SetRobot</w:t>
             </w:r>
             <w:proofErr w:type="spellEnd"/>
             <w:r>
@@ -4727,8 +5370,119 @@
                 <w:sz w:val="16"/>
                 <w:szCs w:val="16"/>
               </w:rPr>
-              <w:t xml:space="preserve"> sent should be G0 X0 Y-10.</w:t>
-            </w:r>
+              <w:t>()</w:t>
+            </w:r>
+            <w:r>
+              <w:rPr>
+                <w:b/>
+                <w:bCs/>
+                <w:color w:val="388600"/>
+                <w:sz w:val="16"/>
+                <w:szCs w:val="16"/>
+              </w:rPr>
+              <w:t xml:space="preserve"> of </w:t>
+            </w:r>
+            <w:r>
+              <w:rPr>
+                <w:b/>
+                <w:bCs/>
+                <w:color w:val="388600"/>
+                <w:sz w:val="16"/>
+                <w:szCs w:val="16"/>
+              </w:rPr>
+              <w:t>“G0 X0 Y-10</w:t>
+            </w:r>
+            <w:r>
+              <w:rPr>
+                <w:b/>
+                <w:bCs/>
+                <w:color w:val="388600"/>
+                <w:sz w:val="16"/>
+                <w:szCs w:val="16"/>
+              </w:rPr>
+              <w:t>\n</w:t>
+            </w:r>
+            <w:r>
+              <w:rPr>
+                <w:b/>
+                <w:bCs/>
+                <w:color w:val="388600"/>
+                <w:sz w:val="16"/>
+                <w:szCs w:val="16"/>
+              </w:rPr>
+              <w:t>”, then “G0 X0 Y-</w:t>
+            </w:r>
+            <w:r>
+              <w:rPr>
+                <w:b/>
+                <w:bCs/>
+                <w:color w:val="388600"/>
+                <w:sz w:val="16"/>
+                <w:szCs w:val="16"/>
+              </w:rPr>
+              <w:t>20\n</w:t>
+            </w:r>
+            <w:r>
+              <w:rPr>
+                <w:b/>
+                <w:bCs/>
+                <w:color w:val="388600"/>
+                <w:sz w:val="16"/>
+                <w:szCs w:val="16"/>
+              </w:rPr>
+              <w:t>” and then “G0 X0 Y-</w:t>
+            </w:r>
+            <w:r>
+              <w:rPr>
+                <w:b/>
+                <w:bCs/>
+                <w:color w:val="388600"/>
+                <w:sz w:val="16"/>
+                <w:szCs w:val="16"/>
+              </w:rPr>
+              <w:t>3</w:t>
+            </w:r>
+            <w:r>
+              <w:rPr>
+                <w:b/>
+                <w:bCs/>
+                <w:color w:val="388600"/>
+                <w:sz w:val="16"/>
+                <w:szCs w:val="16"/>
+              </w:rPr>
+              <w:t>0</w:t>
+            </w:r>
+            <w:r>
+              <w:rPr>
+                <w:b/>
+                <w:bCs/>
+                <w:color w:val="388600"/>
+                <w:sz w:val="16"/>
+                <w:szCs w:val="16"/>
+              </w:rPr>
+              <w:t>\n</w:t>
+            </w:r>
+            <w:r>
+              <w:rPr>
+                <w:b/>
+                <w:bCs/>
+                <w:color w:val="388600"/>
+                <w:sz w:val="16"/>
+                <w:szCs w:val="16"/>
+              </w:rPr>
+              <w:t xml:space="preserve">” for the lines of code sent when reading the file. </w:t>
+            </w:r>
+          </w:p>
+          <w:p>
+            <w:pPr>
+              <w:rPr>
+                <w:b/>
+                <w:bCs/>
+                <w:color w:val="388600"/>
+                <w:sz w:val="16"/>
+                <w:szCs w:val="16"/>
+              </w:rPr>
+            </w:pPr>
           </w:p>
         </w:tc>
       </w:tr>
@@ -4762,28 +5516,101 @@
         </w:tc>
         <w:tc>
           <w:tcPr>
-            <w:tcW w:w="1985" w:type="dxa"/>
-          </w:tcPr>
-          <w:p>
-            <w:pPr>
-              <w:rPr>
-                <w:sz w:val="16"/>
-                <w:szCs w:val="16"/>
-              </w:rPr>
-            </w:pPr>
-          </w:p>
-        </w:tc>
-        <w:tc>
-          <w:tcPr>
-            <w:tcW w:w="2410" w:type="dxa"/>
-          </w:tcPr>
-          <w:p>
-            <w:pPr>
-              <w:rPr>
-                <w:sz w:val="16"/>
-                <w:szCs w:val="16"/>
-              </w:rPr>
-            </w:pPr>
+            <w:tcW w:w="2127" w:type="dxa"/>
+          </w:tcPr>
+          <w:p>
+            <w:pPr>
+              <w:rPr>
+                <w:sz w:val="16"/>
+                <w:szCs w:val="16"/>
+              </w:rPr>
+            </w:pPr>
+            <w:r>
+              <w:rPr>
+                <w:b/>
+                <w:bCs/>
+                <w:color w:val="388600"/>
+                <w:sz w:val="16"/>
+                <w:szCs w:val="16"/>
+              </w:rPr>
+              <w:t>Test using a file with sentences on multiple lines</w:t>
+            </w:r>
+          </w:p>
+        </w:tc>
+        <w:tc>
+          <w:tcPr>
+            <w:tcW w:w="2268" w:type="dxa"/>
+          </w:tcPr>
+          <w:p>
+            <w:pPr>
+              <w:rPr>
+                <w:b/>
+                <w:bCs/>
+                <w:color w:val="388600"/>
+                <w:sz w:val="16"/>
+                <w:szCs w:val="16"/>
+              </w:rPr>
+            </w:pPr>
+            <w:r>
+              <w:rPr>
+                <w:b/>
+                <w:bCs/>
+                <w:color w:val="388600"/>
+                <w:sz w:val="16"/>
+                <w:szCs w:val="16"/>
+              </w:rPr>
+              <w:t>“</w:t>
+            </w:r>
+          </w:p>
+          <w:p>
+            <w:pPr>
+              <w:rPr>
+                <w:b/>
+                <w:bCs/>
+                <w:color w:val="388600"/>
+                <w:sz w:val="16"/>
+                <w:szCs w:val="16"/>
+              </w:rPr>
+            </w:pPr>
+          </w:p>
+          <w:p>
+            <w:pPr>
+              <w:rPr>
+                <w:b/>
+                <w:bCs/>
+                <w:color w:val="388600"/>
+                <w:sz w:val="16"/>
+                <w:szCs w:val="16"/>
+              </w:rPr>
+            </w:pPr>
+            <w:r>
+              <w:rPr>
+                <w:b/>
+                <w:bCs/>
+                <w:color w:val="388600"/>
+                <w:sz w:val="16"/>
+                <w:szCs w:val="16"/>
+              </w:rPr>
+              <w:t>Hi</w:t>
+            </w:r>
+          </w:p>
+          <w:p>
+            <w:pPr>
+              <w:rPr>
+                <w:sz w:val="16"/>
+                <w:szCs w:val="16"/>
+              </w:rPr>
+            </w:pPr>
+            <w:r>
+              <w:rPr>
+                <w:b/>
+                <w:bCs/>
+                <w:color w:val="388600"/>
+                <w:sz w:val="16"/>
+                <w:szCs w:val="16"/>
+              </w:rPr>
+              <w:t>My name is Cal.”  (Font Size 5)</w:t>
+            </w:r>
           </w:p>
         </w:tc>
         <w:tc>
@@ -4793,6 +5620,161 @@
           <w:p>
             <w:pPr>
               <w:rPr>
+                <w:b/>
+                <w:bCs/>
+                <w:color w:val="388600"/>
+                <w:sz w:val="16"/>
+                <w:szCs w:val="16"/>
+              </w:rPr>
+            </w:pPr>
+            <w:r>
+              <w:rPr>
+                <w:b/>
+                <w:bCs/>
+                <w:color w:val="388600"/>
+                <w:sz w:val="16"/>
+                <w:szCs w:val="16"/>
+              </w:rPr>
+              <w:t xml:space="preserve">This function should cause an output in send commands after </w:t>
+            </w:r>
+            <w:proofErr w:type="spellStart"/>
+            <w:r>
+              <w:rPr>
+                <w:b/>
+                <w:bCs/>
+                <w:color w:val="388600"/>
+                <w:sz w:val="16"/>
+                <w:szCs w:val="16"/>
+              </w:rPr>
+              <w:t>SetNewLine</w:t>
+            </w:r>
+            <w:proofErr w:type="spellEnd"/>
+            <w:r>
+              <w:rPr>
+                <w:b/>
+                <w:bCs/>
+                <w:color w:val="388600"/>
+                <w:sz w:val="16"/>
+                <w:szCs w:val="16"/>
+              </w:rPr>
+              <w:t xml:space="preserve">() </w:t>
+            </w:r>
+            <w:r>
+              <w:rPr>
+                <w:b/>
+                <w:bCs/>
+                <w:color w:val="388600"/>
+                <w:sz w:val="16"/>
+                <w:szCs w:val="16"/>
+              </w:rPr>
+              <w:t xml:space="preserve">of the </w:t>
+            </w:r>
+            <w:proofErr w:type="spellStart"/>
+            <w:r>
+              <w:rPr>
+                <w:b/>
+                <w:bCs/>
+                <w:color w:val="388600"/>
+                <w:sz w:val="16"/>
+                <w:szCs w:val="16"/>
+              </w:rPr>
+              <w:t>GCode</w:t>
+            </w:r>
+            <w:proofErr w:type="spellEnd"/>
+            <w:r>
+              <w:rPr>
+                <w:b/>
+                <w:bCs/>
+                <w:color w:val="388600"/>
+                <w:sz w:val="16"/>
+                <w:szCs w:val="16"/>
+              </w:rPr>
+              <w:t xml:space="preserve"> for the letter H and then </w:t>
+            </w:r>
+            <w:proofErr w:type="spellStart"/>
+            <w:r>
+              <w:rPr>
+                <w:b/>
+                <w:bCs/>
+                <w:color w:val="388600"/>
+                <w:sz w:val="16"/>
+                <w:szCs w:val="16"/>
+              </w:rPr>
+              <w:t>i</w:t>
+            </w:r>
+            <w:proofErr w:type="spellEnd"/>
+            <w:r>
+              <w:rPr>
+                <w:b/>
+                <w:bCs/>
+                <w:color w:val="388600"/>
+                <w:sz w:val="16"/>
+                <w:szCs w:val="16"/>
+              </w:rPr>
+              <w:t xml:space="preserve"> and when tested in </w:t>
+            </w:r>
+            <w:proofErr w:type="spellStart"/>
+            <w:r>
+              <w:rPr>
+                <w:b/>
+                <w:bCs/>
+                <w:color w:val="388600"/>
+                <w:sz w:val="16"/>
+                <w:szCs w:val="16"/>
+              </w:rPr>
+              <w:t>GCode</w:t>
+            </w:r>
+            <w:proofErr w:type="spellEnd"/>
+            <w:r>
+              <w:rPr>
+                <w:b/>
+                <w:bCs/>
+                <w:color w:val="388600"/>
+                <w:sz w:val="16"/>
+                <w:szCs w:val="16"/>
+              </w:rPr>
+              <w:t xml:space="preserve"> simulator </w:t>
+            </w:r>
+            <w:r>
+              <w:rPr>
+                <w:b/>
+                <w:bCs/>
+                <w:color w:val="388600"/>
+                <w:sz w:val="16"/>
+                <w:szCs w:val="16"/>
+              </w:rPr>
+              <w:lastRenderedPageBreak/>
+              <w:t xml:space="preserve">they should draw a H and an </w:t>
+            </w:r>
+            <w:proofErr w:type="spellStart"/>
+            <w:r>
+              <w:rPr>
+                <w:b/>
+                <w:bCs/>
+                <w:color w:val="388600"/>
+                <w:sz w:val="16"/>
+                <w:szCs w:val="16"/>
+              </w:rPr>
+              <w:t>i</w:t>
+            </w:r>
+            <w:proofErr w:type="spellEnd"/>
+            <w:r>
+              <w:rPr>
+                <w:b/>
+                <w:bCs/>
+                <w:color w:val="388600"/>
+                <w:sz w:val="16"/>
+                <w:szCs w:val="16"/>
+              </w:rPr>
+              <w:t xml:space="preserve"> next to each other</w:t>
+            </w:r>
+          </w:p>
+          <w:p>
+            <w:pPr>
+              <w:rPr>
+                <w:b/>
+                <w:bCs/>
+                <w:color w:val="388600"/>
                 <w:sz w:val="16"/>
                 <w:szCs w:val="16"/>
               </w:rPr>
@@ -4824,40 +5806,183 @@
                 <w:sz w:val="20"/>
                 <w:szCs w:val="18"/>
               </w:rPr>
+              <w:lastRenderedPageBreak/>
               <w:t>SetRobot()</w:t>
             </w:r>
           </w:p>
         </w:tc>
         <w:tc>
           <w:tcPr>
-            <w:tcW w:w="1985" w:type="dxa"/>
-          </w:tcPr>
-          <w:p>
-            <w:pPr>
-              <w:rPr>
-                <w:sz w:val="16"/>
-                <w:szCs w:val="16"/>
-              </w:rPr>
-            </w:pPr>
-          </w:p>
-        </w:tc>
-        <w:tc>
-          <w:tcPr>
-            <w:tcW w:w="2410" w:type="dxa"/>
-          </w:tcPr>
-          <w:p>
-            <w:pPr>
-              <w:rPr>
-                <w:sz w:val="16"/>
-                <w:szCs w:val="16"/>
-              </w:rPr>
-            </w:pPr>
+            <w:tcW w:w="2127" w:type="dxa"/>
+          </w:tcPr>
+          <w:p>
+            <w:pPr>
+              <w:rPr>
+                <w:b/>
+                <w:bCs/>
+                <w:color w:val="388600"/>
+                <w:sz w:val="16"/>
+                <w:szCs w:val="16"/>
+              </w:rPr>
+            </w:pPr>
+            <w:r>
+              <w:rPr>
+                <w:b/>
+                <w:bCs/>
+                <w:color w:val="388600"/>
+                <w:sz w:val="16"/>
+                <w:szCs w:val="16"/>
+              </w:rPr>
+              <w:t>Make sure it sets the robot to the right place and sends the right commands</w:t>
+            </w:r>
+          </w:p>
+          <w:p>
+            <w:pPr>
+              <w:rPr>
+                <w:b/>
+                <w:bCs/>
+                <w:color w:val="388600"/>
+                <w:sz w:val="16"/>
+                <w:szCs w:val="16"/>
+              </w:rPr>
+            </w:pPr>
+          </w:p>
+        </w:tc>
+        <w:tc>
+          <w:tcPr>
+            <w:tcW w:w="2268" w:type="dxa"/>
+          </w:tcPr>
+          <w:p>
+            <w:pPr>
+              <w:rPr>
+                <w:b/>
+                <w:bCs/>
+                <w:color w:val="388600"/>
+                <w:sz w:val="16"/>
+                <w:szCs w:val="16"/>
+              </w:rPr>
+            </w:pPr>
+            <w:r>
+              <w:rPr>
+                <w:b/>
+                <w:bCs/>
+                <w:color w:val="388600"/>
+                <w:sz w:val="16"/>
+                <w:szCs w:val="16"/>
+              </w:rPr>
+              <w:t xml:space="preserve">Run the </w:t>
+            </w:r>
+            <w:proofErr w:type="spellStart"/>
+            <w:r>
+              <w:rPr>
+                <w:b/>
+                <w:bCs/>
+                <w:color w:val="388600"/>
+                <w:sz w:val="16"/>
+                <w:szCs w:val="16"/>
+              </w:rPr>
+              <w:t>main.c</w:t>
+            </w:r>
+            <w:proofErr w:type="spellEnd"/>
           </w:p>
         </w:tc>
         <w:tc>
           <w:tcPr>
             <w:tcW w:w="2925" w:type="dxa"/>
           </w:tcPr>
+          <w:p>
+            <w:pPr>
+              <w:rPr>
+                <w:b/>
+                <w:bCs/>
+                <w:color w:val="388600"/>
+                <w:sz w:val="16"/>
+                <w:szCs w:val="16"/>
+              </w:rPr>
+            </w:pPr>
+            <w:r>
+              <w:rPr>
+                <w:b/>
+                <w:bCs/>
+                <w:color w:val="388600"/>
+                <w:sz w:val="16"/>
+                <w:szCs w:val="16"/>
+              </w:rPr>
+              <w:t xml:space="preserve">First </w:t>
+            </w:r>
+            <w:proofErr w:type="spellStart"/>
+            <w:r>
+              <w:rPr>
+                <w:b/>
+                <w:bCs/>
+                <w:color w:val="388600"/>
+                <w:sz w:val="16"/>
+                <w:szCs w:val="16"/>
+              </w:rPr>
+              <w:t>GCode</w:t>
+            </w:r>
+            <w:proofErr w:type="spellEnd"/>
+            <w:r>
+              <w:rPr>
+                <w:b/>
+                <w:bCs/>
+                <w:color w:val="388600"/>
+                <w:sz w:val="16"/>
+                <w:szCs w:val="16"/>
+              </w:rPr>
+              <w:t xml:space="preserve"> sent should be </w:t>
+            </w:r>
+            <w:r>
+              <w:rPr>
+                <w:b/>
+                <w:bCs/>
+                <w:color w:val="388600"/>
+                <w:sz w:val="16"/>
+                <w:szCs w:val="16"/>
+              </w:rPr>
+              <w:t>"G1 X0 Y0 F1000\n"</w:t>
+            </w:r>
+            <w:r>
+              <w:rPr>
+                <w:b/>
+                <w:bCs/>
+                <w:color w:val="388600"/>
+                <w:sz w:val="16"/>
+                <w:szCs w:val="16"/>
+              </w:rPr>
+              <w:t xml:space="preserve">, then </w:t>
+            </w:r>
+            <w:r>
+              <w:rPr>
+                <w:b/>
+                <w:bCs/>
+                <w:color w:val="388600"/>
+                <w:sz w:val="16"/>
+                <w:szCs w:val="16"/>
+              </w:rPr>
+              <w:t>"M3\n"</w:t>
+            </w:r>
+            <w:r>
+              <w:rPr>
+                <w:b/>
+                <w:bCs/>
+                <w:color w:val="388600"/>
+                <w:sz w:val="16"/>
+                <w:szCs w:val="16"/>
+              </w:rPr>
+              <w:t xml:space="preserve"> and then </w:t>
+            </w:r>
+            <w:r>
+              <w:rPr>
+                <w:b/>
+                <w:bCs/>
+                <w:color w:val="388600"/>
+                <w:sz w:val="16"/>
+                <w:szCs w:val="16"/>
+              </w:rPr>
+              <w:t>"S0\n"</w:t>
+            </w:r>
+          </w:p>
           <w:p>
             <w:pPr>
               <w:rPr>
@@ -4914,6 +6039,9 @@
         <w:jc w:val="center"/>
       </w:pPr>
       <w:r>
+        <w:rPr>
+          <w:noProof/>
+        </w:rPr>
         <w:drawing>
           <wp:inline distT="0" distB="0" distL="0" distR="0" wp14:anchorId="1629A0D1" wp14:editId="75AECDFD">
             <wp:extent cx="5480423" cy="8450580"/>
@@ -4956,6 +6084,9 @@
         <w:jc w:val="center"/>
       </w:pPr>
       <w:r>
+        <w:rPr>
+          <w:noProof/>
+        </w:rPr>
         <w:lastRenderedPageBreak/>
         <w:drawing>
           <wp:inline distT="0" distB="0" distL="0" distR="0" wp14:anchorId="026549D4" wp14:editId="2A19ED50">
@@ -5003,6 +6134,9 @@
         </w:drawing>
       </w:r>
       <w:r>
+        <w:rPr>
+          <w:noProof/>
+        </w:rPr>
         <w:drawing>
           <wp:inline distT="0" distB="0" distL="0" distR="0" wp14:anchorId="4295D75E" wp14:editId="5C89F536">
             <wp:extent cx="5029200" cy="3900729"/>
@@ -5074,6 +6208,9 @@
         <w:jc w:val="center"/>
       </w:pPr>
       <w:r>
+        <w:rPr>
+          <w:noProof/>
+        </w:rPr>
         <w:drawing>
           <wp:inline distT="0" distB="0" distL="0" distR="0" wp14:anchorId="34B7C56D" wp14:editId="391B49E4">
             <wp:extent cx="6085086" cy="7105650"/>
@@ -5151,6 +6288,9 @@
         <w:jc w:val="center"/>
       </w:pPr>
       <w:r>
+        <w:rPr>
+          <w:noProof/>
+        </w:rPr>
         <w:lastRenderedPageBreak/>
         <w:drawing>
           <wp:inline distT="0" distB="0" distL="0" distR="0" wp14:anchorId="242FCBA1" wp14:editId="68BEF7BD">
@@ -5194,6 +6334,9 @@
         <w:jc w:val="center"/>
       </w:pPr>
       <w:r>
+        <w:rPr>
+          <w:noProof/>
+        </w:rPr>
         <w:drawing>
           <wp:inline distT="0" distB="0" distL="0" distR="0" wp14:anchorId="43B15058" wp14:editId="6B29723C">
             <wp:extent cx="4041061" cy="4238625"/>
@@ -5251,6 +6394,9 @@
         <w:jc w:val="center"/>
       </w:pPr>
       <w:r>
+        <w:rPr>
+          <w:noProof/>
+        </w:rPr>
         <w:drawing>
           <wp:inline distT="0" distB="0" distL="0" distR="0" wp14:anchorId="4DFBBF52" wp14:editId="514E6E74">
             <wp:extent cx="6111650" cy="8220075"/>
@@ -5313,6 +6459,9 @@
         <w:jc w:val="center"/>
       </w:pPr>
       <w:r>
+        <w:rPr>
+          <w:noProof/>
+        </w:rPr>
         <w:drawing>
           <wp:inline distT="0" distB="0" distL="0" distR="0" wp14:anchorId="15EAC45A" wp14:editId="56DDA6BD">
             <wp:extent cx="4267200" cy="7287606"/>
@@ -6209,7 +7358,6 @@
   <w:style w:type="character" w:default="1" w:styleId="DefaultParagraphFont">
     <w:name w:val="Default Paragraph Font"/>
     <w:uiPriority w:val="1"/>
-    <w:semiHidden/>
     <w:unhideWhenUsed/>
   </w:style>
   <w:style w:type="table" w:default="1" w:styleId="TableNormal">

</xml_diff>

<commit_message>
Sorting a settingup file
</commit_message>
<xml_diff>
--- a/RW25CompletedCodeAndSystemManual/SystemManual25-26.docx
+++ b/RW25CompletedCodeAndSystemManual/SystemManual25-26.docx
@@ -70,72 +70,1085 @@
     <w:p>
       <w:pPr>
         <w:pStyle w:val="Heading1"/>
-      </w:pPr>
-      <w:r>
+        <w:rPr>
+          <w:b/>
+          <w:bCs/>
+          <w:u w:val="single"/>
+        </w:rPr>
+      </w:pPr>
+      <w:r>
+        <w:rPr>
+          <w:b/>
+          <w:bCs/>
+          <w:u w:val="single"/>
+        </w:rPr>
         <w:t>Software Description</w:t>
       </w:r>
       <w:r>
-        <w:t xml:space="preserve"> </w:t>
+        <w:rPr>
+          <w:b/>
+          <w:bCs/>
+          <w:u w:val="single"/>
+        </w:rPr>
+        <w:t>:</w:t>
       </w:r>
     </w:p>
     <w:p>
       <w:pPr>
         <w:rPr>
-          <w:szCs w:val="22"/>
-        </w:rPr>
-      </w:pPr>
-      <w:r>
-        <w:t>(Maximum 1 page)</w:t>
+          <w:b/>
+          <w:bCs/>
+          <w:color w:val="004F88"/>
+        </w:rPr>
+      </w:pPr>
+      <w:r>
+        <w:rPr>
+          <w:b/>
+          <w:bCs/>
+          <w:color w:val="004F88"/>
+        </w:rPr>
+        <w:t>Purpose Of The Software:</w:t>
       </w:r>
     </w:p>
     <w:p>
-      <w:r>
-        <w:t>(What the problem is and what the programme should be doing)</w:t>
+      <w:pPr>
+        <w:rPr>
+          <w:color w:val="000000" w:themeColor="text1"/>
+          <w:sz w:val="20"/>
+          <w:szCs w:val="18"/>
+        </w:rPr>
+      </w:pPr>
+      <w:r>
+        <w:rPr>
+          <w:color w:val="000000" w:themeColor="text1"/>
+          <w:sz w:val="20"/>
+          <w:szCs w:val="18"/>
+        </w:rPr>
+        <w:t xml:space="preserve">My software takes the sentence the user inputs into “SampleLines.txt” and reads it word by word. Then it uses the “SingleStrokeFont.txt” and the font size the user inputs to convert these strokes into the correct </w:t>
+      </w:r>
+      <w:proofErr w:type="spellStart"/>
+      <w:r>
+        <w:rPr>
+          <w:color w:val="000000" w:themeColor="text1"/>
+          <w:sz w:val="20"/>
+          <w:szCs w:val="18"/>
+        </w:rPr>
+        <w:t>GCode</w:t>
+      </w:r>
+      <w:proofErr w:type="spellEnd"/>
+      <w:r>
+        <w:rPr>
+          <w:color w:val="000000" w:themeColor="text1"/>
+          <w:sz w:val="20"/>
+          <w:szCs w:val="18"/>
+        </w:rPr>
+        <w:t xml:space="preserve"> to send to the drawing robot. Each word will then be drawn on the page in lines</w:t>
+      </w:r>
+      <w:r>
+        <w:rPr>
+          <w:color w:val="000000" w:themeColor="text1"/>
+          <w:sz w:val="20"/>
+          <w:szCs w:val="18"/>
+        </w:rPr>
+        <w:t xml:space="preserve"> that have a width of 100mm</w:t>
       </w:r>
     </w:p>
     <w:p>
-      <w:r>
-        <w:t>(Summarise the project brief)</w:t>
-      </w:r>
+      <w:pPr>
+        <w:rPr>
+          <w:b/>
+          <w:bCs/>
+          <w:color w:val="004F88"/>
+          <w:sz w:val="24"/>
+          <w:szCs w:val="22"/>
+        </w:rPr>
+      </w:pPr>
+      <w:r>
+        <w:rPr>
+          <w:b/>
+          <w:bCs/>
+          <w:color w:val="004F88"/>
+          <w:sz w:val="24"/>
+          <w:szCs w:val="22"/>
+        </w:rPr>
+        <w:t>Th</w:t>
+      </w:r>
+      <w:r>
+        <w:rPr>
+          <w:b/>
+          <w:bCs/>
+          <w:color w:val="004F88"/>
+          <w:sz w:val="24"/>
+          <w:szCs w:val="22"/>
+        </w:rPr>
+        <w:t xml:space="preserve">e Problems That </w:t>
+      </w:r>
+      <w:r>
+        <w:rPr>
+          <w:b/>
+          <w:bCs/>
+          <w:color w:val="004F88"/>
+          <w:sz w:val="24"/>
+          <w:szCs w:val="22"/>
+        </w:rPr>
+        <w:t xml:space="preserve">My </w:t>
+      </w:r>
+      <w:r>
+        <w:rPr>
+          <w:b/>
+          <w:bCs/>
+          <w:color w:val="004F88"/>
+          <w:sz w:val="24"/>
+          <w:szCs w:val="22"/>
+        </w:rPr>
+        <w:t>Robot</w:t>
+      </w:r>
+      <w:r>
+        <w:rPr>
+          <w:b/>
+          <w:bCs/>
+          <w:color w:val="004F88"/>
+          <w:sz w:val="24"/>
+          <w:szCs w:val="22"/>
+        </w:rPr>
+        <w:t xml:space="preserve"> Code</w:t>
+      </w:r>
+      <w:r>
+        <w:rPr>
+          <w:b/>
+          <w:bCs/>
+          <w:color w:val="004F88"/>
+          <w:sz w:val="24"/>
+          <w:szCs w:val="22"/>
+        </w:rPr>
+        <w:t xml:space="preserve"> Solves:</w:t>
+      </w:r>
+    </w:p>
+    <w:p>
+      <w:pPr>
+        <w:pStyle w:val="ListParagraph"/>
+        <w:numPr>
+          <w:ilvl w:val="0"/>
+          <w:numId w:val="6"/>
+        </w:numPr>
+        <w:rPr>
+          <w:b/>
+          <w:bCs/>
+          <w:sz w:val="20"/>
+          <w:szCs w:val="18"/>
+        </w:rPr>
+      </w:pPr>
+      <w:r>
+        <w:rPr>
+          <w:b/>
+          <w:bCs/>
+          <w:sz w:val="20"/>
+          <w:szCs w:val="18"/>
+        </w:rPr>
+        <w:t>Storing Font Dat</w:t>
+      </w:r>
+      <w:r>
+        <w:rPr>
+          <w:b/>
+          <w:bCs/>
+          <w:sz w:val="20"/>
+          <w:szCs w:val="18"/>
+        </w:rPr>
+        <w:t>a</w:t>
+      </w:r>
+    </w:p>
+    <w:p>
+      <w:pPr>
+        <w:rPr>
+          <w:sz w:val="20"/>
+          <w:szCs w:val="18"/>
+        </w:rPr>
+      </w:pPr>
+      <w:r>
+        <w:rPr>
+          <w:b/>
+          <w:bCs/>
+          <w:sz w:val="20"/>
+          <w:szCs w:val="18"/>
+        </w:rPr>
+        <w:tab/>
+      </w:r>
+      <w:r>
+        <w:rPr>
+          <w:sz w:val="20"/>
+          <w:szCs w:val="18"/>
+        </w:rPr>
+        <w:t xml:space="preserve">- </w:t>
+      </w:r>
+      <w:r>
+        <w:rPr>
+          <w:sz w:val="20"/>
+          <w:szCs w:val="18"/>
+        </w:rPr>
+        <w:t xml:space="preserve">Defines a struct called </w:t>
+      </w:r>
+      <w:proofErr w:type="spellStart"/>
+      <w:r>
+        <w:rPr>
+          <w:sz w:val="20"/>
+          <w:szCs w:val="18"/>
+        </w:rPr>
+        <w:t>AsciiLine</w:t>
+      </w:r>
+      <w:proofErr w:type="spellEnd"/>
+      <w:r>
+        <w:rPr>
+          <w:sz w:val="20"/>
+          <w:szCs w:val="18"/>
+        </w:rPr>
+        <w:t xml:space="preserve"> that reads the ascii value</w:t>
+      </w:r>
+      <w:r>
+        <w:rPr>
+          <w:sz w:val="20"/>
+          <w:szCs w:val="18"/>
+        </w:rPr>
+        <w:t xml:space="preserve">, number of stroke lines and </w:t>
+      </w:r>
+      <w:r>
+        <w:rPr>
+          <w:sz w:val="20"/>
+          <w:szCs w:val="18"/>
+        </w:rPr>
+        <w:t>sets</w:t>
+      </w:r>
+      <w:r>
+        <w:rPr>
+          <w:sz w:val="20"/>
+          <w:szCs w:val="18"/>
+        </w:rPr>
+        <w:t xml:space="preserve"> the </w:t>
+      </w:r>
+      <w:r>
+        <w:rPr>
+          <w:sz w:val="20"/>
+          <w:szCs w:val="18"/>
+        </w:rPr>
+        <w:tab/>
+        <w:t xml:space="preserve"> </w:t>
+      </w:r>
+      <w:r>
+        <w:rPr>
+          <w:sz w:val="20"/>
+          <w:szCs w:val="18"/>
+        </w:rPr>
+        <w:tab/>
+        <w:t>buffer Lines</w:t>
+      </w:r>
+      <w:r>
+        <w:rPr>
+          <w:sz w:val="20"/>
+          <w:szCs w:val="18"/>
+        </w:rPr>
+        <w:t xml:space="preserve"> with a pointer to it</w:t>
+      </w:r>
+      <w:r>
+        <w:rPr>
+          <w:sz w:val="20"/>
+          <w:szCs w:val="18"/>
+        </w:rPr>
+        <w:t xml:space="preserve"> </w:t>
+      </w:r>
+    </w:p>
+    <w:p>
+      <w:pPr>
+        <w:rPr>
+          <w:sz w:val="20"/>
+          <w:szCs w:val="18"/>
+        </w:rPr>
+      </w:pPr>
+      <w:r>
+        <w:rPr>
+          <w:sz w:val="20"/>
+          <w:szCs w:val="18"/>
+        </w:rPr>
+        <w:tab/>
+        <w:t xml:space="preserve">- </w:t>
+      </w:r>
+      <w:r>
+        <w:rPr>
+          <w:sz w:val="20"/>
+          <w:szCs w:val="18"/>
+        </w:rPr>
+        <w:t>Each ascii character’s strokes are kept in a dynamically size</w:t>
+      </w:r>
+      <w:r>
+        <w:rPr>
+          <w:sz w:val="20"/>
+          <w:szCs w:val="18"/>
+        </w:rPr>
+        <w:t>d</w:t>
+      </w:r>
+      <w:r>
+        <w:rPr>
+          <w:sz w:val="20"/>
+          <w:szCs w:val="18"/>
+        </w:rPr>
+        <w:t xml:space="preserve"> array called </w:t>
+      </w:r>
+      <w:proofErr w:type="spellStart"/>
+      <w:r>
+        <w:rPr>
+          <w:sz w:val="20"/>
+          <w:szCs w:val="18"/>
+        </w:rPr>
+        <w:t>FontArray</w:t>
+      </w:r>
+      <w:proofErr w:type="spellEnd"/>
+      <w:r>
+        <w:rPr>
+          <w:sz w:val="20"/>
+          <w:szCs w:val="18"/>
+        </w:rPr>
+        <w:t xml:space="preserve">, where in each </w:t>
+      </w:r>
+      <w:r>
+        <w:rPr>
+          <w:sz w:val="20"/>
+          <w:szCs w:val="18"/>
+        </w:rPr>
+        <w:tab/>
+        <w:t xml:space="preserve">line the \n is replaced with \0 using </w:t>
+      </w:r>
+      <w:proofErr w:type="spellStart"/>
+      <w:r>
+        <w:rPr>
+          <w:sz w:val="20"/>
+          <w:szCs w:val="18"/>
+        </w:rPr>
+        <w:t>strcspn</w:t>
+      </w:r>
+      <w:proofErr w:type="spellEnd"/>
+      <w:r>
+        <w:rPr>
+          <w:sz w:val="20"/>
+          <w:szCs w:val="18"/>
+        </w:rPr>
+        <w:t xml:space="preserve"> and the exact amount of space in the line is set using </w:t>
+      </w:r>
+      <w:r>
+        <w:rPr>
+          <w:sz w:val="20"/>
+          <w:szCs w:val="18"/>
+        </w:rPr>
+        <w:tab/>
+        <w:t>malloc</w:t>
+      </w:r>
+    </w:p>
+    <w:p>
+      <w:pPr>
+        <w:rPr>
+          <w:sz w:val="20"/>
+          <w:szCs w:val="18"/>
+        </w:rPr>
+      </w:pPr>
+      <w:r>
+        <w:rPr>
+          <w:sz w:val="20"/>
+          <w:szCs w:val="18"/>
+        </w:rPr>
+        <w:tab/>
+      </w:r>
+      <w:r>
+        <w:rPr>
+          <w:b/>
+          <w:bCs/>
+          <w:sz w:val="20"/>
+          <w:szCs w:val="18"/>
+        </w:rPr>
+        <w:t xml:space="preserve">- </w:t>
+      </w:r>
+      <w:r>
+        <w:rPr>
+          <w:sz w:val="20"/>
+          <w:szCs w:val="18"/>
+        </w:rPr>
+        <w:t>The</w:t>
+      </w:r>
+      <w:r>
+        <w:rPr>
+          <w:sz w:val="20"/>
+          <w:szCs w:val="18"/>
+        </w:rPr>
+        <w:t xml:space="preserve"> file pointer, FP,</w:t>
+      </w:r>
+      <w:r>
+        <w:rPr>
+          <w:sz w:val="20"/>
+          <w:szCs w:val="18"/>
+        </w:rPr>
+        <w:t xml:space="preserve"> </w:t>
+      </w:r>
+      <w:r>
+        <w:rPr>
+          <w:sz w:val="20"/>
+          <w:szCs w:val="18"/>
+        </w:rPr>
+        <w:t xml:space="preserve">is used to </w:t>
+      </w:r>
+      <w:r>
+        <w:rPr>
+          <w:sz w:val="20"/>
+          <w:szCs w:val="18"/>
+        </w:rPr>
+        <w:t>scan</w:t>
+      </w:r>
+      <w:r>
+        <w:rPr>
+          <w:sz w:val="20"/>
+          <w:szCs w:val="18"/>
+        </w:rPr>
+        <w:t xml:space="preserve"> all values and when</w:t>
+      </w:r>
+      <w:r>
+        <w:rPr>
+          <w:sz w:val="20"/>
+          <w:szCs w:val="18"/>
+        </w:rPr>
+        <w:t xml:space="preserve"> 999</w:t>
+      </w:r>
+      <w:r>
+        <w:rPr>
+          <w:sz w:val="20"/>
+          <w:szCs w:val="18"/>
+        </w:rPr>
+        <w:t xml:space="preserve"> is scanned </w:t>
+      </w:r>
+      <w:r>
+        <w:rPr>
+          <w:sz w:val="20"/>
+          <w:szCs w:val="18"/>
+        </w:rPr>
+        <w:t>grows</w:t>
+      </w:r>
+      <w:r>
+        <w:rPr>
+          <w:sz w:val="20"/>
+          <w:szCs w:val="18"/>
+        </w:rPr>
+        <w:t xml:space="preserve"> the </w:t>
+      </w:r>
+      <w:proofErr w:type="spellStart"/>
+      <w:r>
+        <w:rPr>
+          <w:sz w:val="20"/>
+          <w:szCs w:val="18"/>
+        </w:rPr>
+        <w:t>FontArray</w:t>
+      </w:r>
+      <w:proofErr w:type="spellEnd"/>
+      <w:r>
+        <w:rPr>
+          <w:sz w:val="20"/>
+          <w:szCs w:val="18"/>
+        </w:rPr>
+        <w:t xml:space="preserve"> </w:t>
+      </w:r>
+      <w:r>
+        <w:rPr>
+          <w:sz w:val="20"/>
+          <w:szCs w:val="18"/>
+        </w:rPr>
+        <w:t xml:space="preserve">using </w:t>
+      </w:r>
+      <w:r>
+        <w:rPr>
+          <w:sz w:val="20"/>
+          <w:szCs w:val="18"/>
+        </w:rPr>
+        <w:tab/>
+      </w:r>
+      <w:proofErr w:type="spellStart"/>
+      <w:r>
+        <w:rPr>
+          <w:sz w:val="20"/>
+          <w:szCs w:val="18"/>
+        </w:rPr>
+        <w:t>realloc</w:t>
+      </w:r>
+      <w:proofErr w:type="spellEnd"/>
+      <w:r>
+        <w:rPr>
+          <w:sz w:val="20"/>
+          <w:szCs w:val="18"/>
+        </w:rPr>
+        <w:t xml:space="preserve">() </w:t>
+      </w:r>
+      <w:r>
+        <w:rPr>
+          <w:sz w:val="20"/>
+          <w:szCs w:val="18"/>
+        </w:rPr>
+        <w:t>by 1 to create a space for the new ascii character to be defined</w:t>
+      </w:r>
+    </w:p>
+    <w:p>
+      <w:pPr>
+        <w:ind w:left="360"/>
+        <w:rPr>
+          <w:sz w:val="20"/>
+          <w:szCs w:val="18"/>
+        </w:rPr>
+      </w:pPr>
+      <w:r>
+        <w:rPr>
+          <w:b/>
+          <w:bCs/>
+          <w:sz w:val="20"/>
+          <w:szCs w:val="18"/>
+        </w:rPr>
+        <w:tab/>
+      </w:r>
+      <w:r>
+        <w:rPr>
+          <w:sz w:val="20"/>
+          <w:szCs w:val="18"/>
+        </w:rPr>
+        <w:t>-</w:t>
+      </w:r>
+      <w:r>
+        <w:rPr>
+          <w:sz w:val="20"/>
+          <w:szCs w:val="18"/>
+        </w:rPr>
+        <w:t xml:space="preserve"> </w:t>
+      </w:r>
+      <w:r>
+        <w:rPr>
+          <w:sz w:val="20"/>
+          <w:szCs w:val="18"/>
+        </w:rPr>
+        <w:t xml:space="preserve">Defines </w:t>
+      </w:r>
+      <w:r>
+        <w:rPr>
+          <w:sz w:val="20"/>
+          <w:szCs w:val="18"/>
+        </w:rPr>
+        <w:t>*</w:t>
+      </w:r>
+      <w:r>
+        <w:rPr>
+          <w:sz w:val="20"/>
+          <w:szCs w:val="18"/>
+        </w:rPr>
+        <w:t>Line</w:t>
+      </w:r>
+      <w:r>
+        <w:rPr>
+          <w:sz w:val="20"/>
+          <w:szCs w:val="18"/>
+        </w:rPr>
+        <w:t>, which</w:t>
+      </w:r>
+      <w:r>
+        <w:rPr>
+          <w:sz w:val="20"/>
+          <w:szCs w:val="18"/>
+        </w:rPr>
+        <w:t xml:space="preserve"> </w:t>
+      </w:r>
+      <w:r>
+        <w:rPr>
+          <w:sz w:val="20"/>
+          <w:szCs w:val="18"/>
+        </w:rPr>
+        <w:t>is</w:t>
+      </w:r>
+      <w:r>
+        <w:rPr>
+          <w:sz w:val="20"/>
+          <w:szCs w:val="18"/>
+        </w:rPr>
+        <w:t xml:space="preserve"> a pointer to </w:t>
+      </w:r>
+      <w:r>
+        <w:rPr>
+          <w:sz w:val="20"/>
+          <w:szCs w:val="18"/>
+        </w:rPr>
+        <w:t xml:space="preserve">each </w:t>
+      </w:r>
+      <w:r>
+        <w:rPr>
+          <w:sz w:val="20"/>
+          <w:szCs w:val="18"/>
+        </w:rPr>
+        <w:t>specific ascii character’s strokes</w:t>
+      </w:r>
+      <w:r>
+        <w:rPr>
+          <w:sz w:val="20"/>
+          <w:szCs w:val="18"/>
+        </w:rPr>
+        <w:t xml:space="preserve"> within</w:t>
+      </w:r>
+      <w:r>
+        <w:rPr>
+          <w:sz w:val="20"/>
+          <w:szCs w:val="18"/>
+        </w:rPr>
+        <w:t xml:space="preserve"> </w:t>
+      </w:r>
+      <w:proofErr w:type="spellStart"/>
+      <w:r>
+        <w:rPr>
+          <w:sz w:val="20"/>
+          <w:szCs w:val="18"/>
+        </w:rPr>
+        <w:t>FontArray</w:t>
+      </w:r>
+      <w:proofErr w:type="spellEnd"/>
+      <w:r>
+        <w:rPr>
+          <w:sz w:val="20"/>
+          <w:szCs w:val="18"/>
+        </w:rPr>
+        <w:t xml:space="preserve"> </w:t>
+      </w:r>
+      <w:r>
+        <w:rPr>
+          <w:sz w:val="20"/>
+          <w:szCs w:val="18"/>
+        </w:rPr>
+        <w:t xml:space="preserve">and </w:t>
+      </w:r>
+      <w:r>
+        <w:rPr>
+          <w:sz w:val="20"/>
+          <w:szCs w:val="18"/>
+        </w:rPr>
+        <w:t xml:space="preserve">can </w:t>
+      </w:r>
+      <w:r>
+        <w:rPr>
+          <w:sz w:val="20"/>
+          <w:szCs w:val="18"/>
+        </w:rPr>
+        <w:tab/>
+      </w:r>
+      <w:r>
+        <w:rPr>
+          <w:sz w:val="20"/>
+          <w:szCs w:val="18"/>
+        </w:rPr>
+        <w:t xml:space="preserve">be used with Lines buffer to point at </w:t>
+      </w:r>
+      <w:r>
+        <w:rPr>
+          <w:sz w:val="20"/>
+          <w:szCs w:val="18"/>
+        </w:rPr>
+        <w:t>spec</w:t>
+      </w:r>
+      <w:r>
+        <w:rPr>
+          <w:sz w:val="20"/>
+          <w:szCs w:val="18"/>
+        </w:rPr>
+        <w:t>i</w:t>
+      </w:r>
+      <w:r>
+        <w:rPr>
+          <w:sz w:val="20"/>
+          <w:szCs w:val="18"/>
+        </w:rPr>
+        <w:t>fic line</w:t>
+      </w:r>
+      <w:r>
+        <w:rPr>
+          <w:sz w:val="20"/>
+          <w:szCs w:val="18"/>
+        </w:rPr>
+        <w:t>s to</w:t>
+      </w:r>
+      <w:r>
+        <w:rPr>
+          <w:sz w:val="20"/>
+          <w:szCs w:val="18"/>
+        </w:rPr>
+        <w:t xml:space="preserve"> either input values into </w:t>
+      </w:r>
+      <w:r>
+        <w:rPr>
+          <w:sz w:val="20"/>
+          <w:szCs w:val="18"/>
+        </w:rPr>
+        <w:t xml:space="preserve">the array </w:t>
+      </w:r>
+      <w:r>
+        <w:rPr>
+          <w:sz w:val="20"/>
+          <w:szCs w:val="18"/>
+        </w:rPr>
+        <w:t xml:space="preserve">or scan </w:t>
+      </w:r>
+      <w:r>
+        <w:rPr>
+          <w:sz w:val="20"/>
+          <w:szCs w:val="18"/>
+        </w:rPr>
+        <w:tab/>
+      </w:r>
+      <w:r>
+        <w:rPr>
+          <w:sz w:val="20"/>
+          <w:szCs w:val="18"/>
+        </w:rPr>
+        <w:t>values from it</w:t>
+      </w:r>
+    </w:p>
+    <w:p>
+      <w:pPr>
+        <w:pStyle w:val="ListParagraph"/>
+        <w:numPr>
+          <w:ilvl w:val="0"/>
+          <w:numId w:val="5"/>
+        </w:numPr>
+        <w:rPr>
+          <w:b/>
+          <w:bCs/>
+          <w:sz w:val="20"/>
+          <w:szCs w:val="18"/>
+        </w:rPr>
+      </w:pPr>
+      <w:r>
+        <w:rPr>
+          <w:b/>
+          <w:bCs/>
+          <w:sz w:val="20"/>
+          <w:szCs w:val="18"/>
+        </w:rPr>
+        <w:t>Setting Up The Robot</w:t>
+      </w:r>
+    </w:p>
+    <w:p>
+      <w:pPr>
+        <w:rPr>
+          <w:sz w:val="20"/>
+          <w:szCs w:val="18"/>
+        </w:rPr>
+      </w:pPr>
+      <w:r>
+        <w:rPr>
+          <w:sz w:val="20"/>
+          <w:szCs w:val="18"/>
+        </w:rPr>
+        <w:tab/>
+        <w:t xml:space="preserve">- </w:t>
+      </w:r>
+      <w:r>
+        <w:rPr>
+          <w:sz w:val="20"/>
+          <w:szCs w:val="18"/>
+        </w:rPr>
+        <w:t xml:space="preserve">Moves the robot to 0,0 X and Y Coordinates and then creates a new line before scanning the </w:t>
+      </w:r>
+      <w:r>
+        <w:rPr>
+          <w:sz w:val="20"/>
+          <w:szCs w:val="18"/>
+        </w:rPr>
+        <w:tab/>
+        <w:t>sentence</w:t>
+      </w:r>
+    </w:p>
+    <w:p>
+      <w:pPr>
+        <w:pStyle w:val="ListParagraph"/>
+        <w:numPr>
+          <w:ilvl w:val="0"/>
+          <w:numId w:val="5"/>
+        </w:numPr>
+        <w:rPr>
+          <w:b/>
+          <w:bCs/>
+          <w:sz w:val="20"/>
+          <w:szCs w:val="18"/>
+        </w:rPr>
+      </w:pPr>
+      <w:r>
+        <w:rPr>
+          <w:b/>
+          <w:bCs/>
+          <w:sz w:val="20"/>
+          <w:szCs w:val="18"/>
+        </w:rPr>
+        <w:t>Font Size</w:t>
+      </w:r>
+    </w:p>
+    <w:p>
+      <w:pPr>
+        <w:rPr>
+          <w:sz w:val="20"/>
+          <w:szCs w:val="18"/>
+        </w:rPr>
+      </w:pPr>
+      <w:r>
+        <w:rPr>
+          <w:sz w:val="20"/>
+          <w:szCs w:val="18"/>
+        </w:rPr>
+        <w:tab/>
+        <w:t xml:space="preserve">- </w:t>
+      </w:r>
+    </w:p>
+    <w:p>
+      <w:pPr>
+        <w:pStyle w:val="ListParagraph"/>
+        <w:numPr>
+          <w:ilvl w:val="0"/>
+          <w:numId w:val="5"/>
+        </w:numPr>
+        <w:rPr>
+          <w:b/>
+          <w:bCs/>
+          <w:sz w:val="20"/>
+          <w:szCs w:val="18"/>
+        </w:rPr>
+      </w:pPr>
+      <w:r>
+        <w:rPr>
+          <w:b/>
+          <w:bCs/>
+          <w:sz w:val="20"/>
+          <w:szCs w:val="18"/>
+        </w:rPr>
+        <w:t>Checking The Word Fits On The Page</w:t>
+      </w:r>
+    </w:p>
+    <w:p>
+      <w:pPr>
+        <w:ind w:left="360"/>
+        <w:rPr>
+          <w:b/>
+          <w:bCs/>
+          <w:sz w:val="20"/>
+          <w:szCs w:val="18"/>
+        </w:rPr>
+      </w:pPr>
+      <w:r>
+        <w:rPr>
+          <w:b/>
+          <w:bCs/>
+          <w:sz w:val="20"/>
+          <w:szCs w:val="18"/>
+        </w:rPr>
+        <w:tab/>
+        <w:t>-</w:t>
+      </w:r>
+    </w:p>
+    <w:p>
+      <w:pPr>
+        <w:pStyle w:val="ListParagraph"/>
+        <w:numPr>
+          <w:ilvl w:val="0"/>
+          <w:numId w:val="5"/>
+        </w:numPr>
+        <w:rPr>
+          <w:b/>
+          <w:bCs/>
+          <w:sz w:val="20"/>
+          <w:szCs w:val="18"/>
+        </w:rPr>
+      </w:pPr>
+      <w:r>
+        <w:rPr>
+          <w:b/>
+          <w:bCs/>
+          <w:sz w:val="20"/>
+          <w:szCs w:val="18"/>
+        </w:rPr>
+        <w:t>Creating A New Line</w:t>
+      </w:r>
+    </w:p>
+    <w:p>
+      <w:pPr>
+        <w:rPr>
+          <w:b/>
+          <w:bCs/>
+          <w:sz w:val="20"/>
+          <w:szCs w:val="18"/>
+        </w:rPr>
+      </w:pPr>
+      <w:r>
+        <w:rPr>
+          <w:b/>
+          <w:bCs/>
+          <w:sz w:val="20"/>
+          <w:szCs w:val="18"/>
+        </w:rPr>
+        <w:tab/>
+        <w:t>-</w:t>
+      </w:r>
+    </w:p>
+    <w:p>
+      <w:pPr>
+        <w:pStyle w:val="ListParagraph"/>
+        <w:numPr>
+          <w:ilvl w:val="0"/>
+          <w:numId w:val="5"/>
+        </w:numPr>
+        <w:rPr>
+          <w:b/>
+          <w:bCs/>
+          <w:sz w:val="20"/>
+          <w:szCs w:val="18"/>
+        </w:rPr>
+      </w:pPr>
+      <w:r>
+        <w:rPr>
+          <w:b/>
+          <w:bCs/>
+          <w:sz w:val="20"/>
+          <w:szCs w:val="18"/>
+        </w:rPr>
+        <w:t>Converting Each Character</w:t>
+      </w:r>
+      <w:r>
+        <w:rPr>
+          <w:b/>
+          <w:bCs/>
+          <w:sz w:val="20"/>
+          <w:szCs w:val="18"/>
+        </w:rPr>
+        <w:t>’s</w:t>
+      </w:r>
+      <w:r>
+        <w:rPr>
+          <w:b/>
+          <w:bCs/>
+          <w:sz w:val="20"/>
+          <w:szCs w:val="18"/>
+        </w:rPr>
+        <w:t xml:space="preserve"> Font Stroke Line</w:t>
+      </w:r>
+      <w:r>
+        <w:rPr>
+          <w:b/>
+          <w:bCs/>
+          <w:sz w:val="20"/>
+          <w:szCs w:val="18"/>
+        </w:rPr>
+        <w:t>s</w:t>
+      </w:r>
+      <w:r>
+        <w:rPr>
+          <w:b/>
+          <w:bCs/>
+          <w:sz w:val="20"/>
+          <w:szCs w:val="18"/>
+        </w:rPr>
+        <w:t xml:space="preserve"> Into </w:t>
+      </w:r>
+      <w:proofErr w:type="spellStart"/>
+      <w:r>
+        <w:rPr>
+          <w:b/>
+          <w:bCs/>
+          <w:sz w:val="20"/>
+          <w:szCs w:val="18"/>
+        </w:rPr>
+        <w:t>GCode</w:t>
+      </w:r>
+      <w:proofErr w:type="spellEnd"/>
+    </w:p>
+    <w:p>
+      <w:pPr>
+        <w:rPr>
+          <w:b/>
+          <w:bCs/>
+        </w:rPr>
+      </w:pPr>
+      <w:r>
+        <w:rPr>
+          <w:b/>
+          <w:bCs/>
+        </w:rPr>
+        <w:tab/>
+        <w:t>-</w:t>
+      </w:r>
+    </w:p>
+    <w:p>
+      <w:pPr>
+        <w:pStyle w:val="ListParagraph"/>
+        <w:numPr>
+          <w:ilvl w:val="0"/>
+          <w:numId w:val="5"/>
+        </w:numPr>
+        <w:rPr>
+          <w:b/>
+          <w:bCs/>
+        </w:rPr>
+      </w:pPr>
+      <w:r>
+        <w:rPr>
+          <w:b/>
+          <w:bCs/>
+        </w:rPr>
+        <w:t>Input Errors</w:t>
+      </w:r>
+    </w:p>
+    <w:p>
+      <w:pPr>
+        <w:rPr>
+          <w:b/>
+          <w:bCs/>
+          <w:color w:val="004F88"/>
+          <w:sz w:val="24"/>
+          <w:szCs w:val="22"/>
+        </w:rPr>
+      </w:pPr>
+    </w:p>
+    <w:p>
+      <w:pPr>
+        <w:rPr>
+          <w:b/>
+          <w:bCs/>
+          <w:color w:val="004F88"/>
+          <w:sz w:val="24"/>
+          <w:szCs w:val="22"/>
+        </w:rPr>
+      </w:pPr>
+    </w:p>
+    <w:p>
+      <w:pPr>
+        <w:pStyle w:val="ListParagraph"/>
+        <w:rPr>
+          <w:b/>
+          <w:bCs/>
+        </w:rPr>
+      </w:pPr>
+    </w:p>
+    <w:p>
+      <w:pPr>
+        <w:rPr>
+          <w:b/>
+          <w:bCs/>
+        </w:rPr>
+      </w:pPr>
     </w:p>
     <w:p/>
     <w:p/>
-    <w:p/>
-    <w:p/>
-    <w:p/>
-    <w:p/>
-    <w:p/>
-    <w:p/>
-    <w:p/>
-    <w:p/>
-    <w:p/>
-    <w:p/>
-    <w:p/>
-    <w:p/>
-    <w:p/>
-    <w:p/>
-    <w:p/>
-    <w:p/>
-    <w:p/>
-    <w:p/>
-    <w:p/>
-    <w:p/>
-    <w:p/>
-    <w:p/>
-    <w:p/>
-    <w:p/>
     <w:p>
       <w:pPr>
         <w:pStyle w:val="Heading1"/>
         <w:rPr>
           <w:b/>
           <w:bCs/>
-        </w:rPr>
-      </w:pPr>
-      <w:r>
-        <w:rPr>
-          <w:b/>
-          <w:bCs/>
+          <w:u w:val="single"/>
+        </w:rPr>
+      </w:pPr>
+      <w:r>
+        <w:rPr>
+          <w:b/>
+          <w:bCs/>
+          <w:u w:val="single"/>
         </w:rPr>
         <w:lastRenderedPageBreak/>
         <w:t>Project Files</w:t>
@@ -144,6 +1157,7 @@
         <w:rPr>
           <w:b/>
           <w:bCs/>
+          <w:u w:val="single"/>
         </w:rPr>
         <w:t xml:space="preserve"> MAX ONE PAGE</w:t>
       </w:r>
@@ -669,8 +1683,18 @@
     <w:p>
       <w:pPr>
         <w:pStyle w:val="Heading1"/>
-      </w:pPr>
-      <w:r>
+        <w:rPr>
+          <w:b/>
+          <w:bCs/>
+          <w:u w:val="single"/>
+        </w:rPr>
+      </w:pPr>
+      <w:r>
+        <w:rPr>
+          <w:b/>
+          <w:bCs/>
+          <w:u w:val="single"/>
+        </w:rPr>
         <w:lastRenderedPageBreak/>
         <w:t>Key Data Items</w:t>
       </w:r>
@@ -2851,6 +3875,20 @@
                 <w:sz w:val="20"/>
               </w:rPr>
             </w:pPr>
+            <w:r>
+              <w:rPr>
+                <w:color w:val="EE0000"/>
+                <w:sz w:val="20"/>
+              </w:rPr>
+              <w:t>An integer that  is 0 and becomes 1 when a</w:t>
+            </w:r>
+            <w:r>
+              <w:rPr>
+                <w:color w:val="EE0000"/>
+                <w:sz w:val="20"/>
+              </w:rPr>
+              <w:t xml:space="preserve"> </w:t>
+            </w:r>
           </w:p>
         </w:tc>
       </w:tr>
@@ -2858,12 +3896,27 @@
     <w:p>
       <w:pPr>
         <w:pStyle w:val="Heading1"/>
-      </w:pPr>
-      <w:r>
+        <w:rPr>
+          <w:b/>
+          <w:bCs/>
+          <w:u w:val="single"/>
+        </w:rPr>
+      </w:pPr>
+      <w:r>
+        <w:rPr>
+          <w:b/>
+          <w:bCs/>
+          <w:u w:val="single"/>
+        </w:rPr>
         <w:lastRenderedPageBreak/>
         <w:t>Function</w:t>
       </w:r>
       <w:r>
+        <w:rPr>
+          <w:b/>
+          <w:bCs/>
+          <w:u w:val="single"/>
+        </w:rPr>
         <w:t>s</w:t>
       </w:r>
     </w:p>
@@ -2968,32 +4021,26 @@
     <w:p>
       <w:pPr>
         <w:rPr>
-          <w:b/>
-          <w:bCs/>
-        </w:rPr>
-      </w:pPr>
-      <w:r>
-        <w:rPr>
-          <w:b/>
-          <w:bCs/>
-        </w:rPr>
-        <w:t xml:space="preserve">void </w:t>
-      </w:r>
-      <w:proofErr w:type="spellStart"/>
-      <w:r>
-        <w:rPr>
-          <w:b/>
-          <w:bCs/>
-        </w:rPr>
-        <w:t>ReadNextWord</w:t>
-      </w:r>
-      <w:proofErr w:type="spellEnd"/>
-      <w:r>
-        <w:rPr>
-          <w:b/>
-          <w:bCs/>
-        </w:rPr>
-        <w:t>(void)</w:t>
+          <w:rFonts w:asciiTheme="majorHAnsi" w:hAnsiTheme="majorHAnsi" w:cstheme="majorHAnsi"/>
+          <w:b/>
+          <w:bCs/>
+          <w:color w:val="004F88"/>
+          <w:sz w:val="32"/>
+          <w:szCs w:val="32"/>
+          <w:u w:val="single"/>
+        </w:rPr>
+      </w:pPr>
+      <w:r>
+        <w:rPr>
+          <w:rFonts w:asciiTheme="majorHAnsi" w:hAnsiTheme="majorHAnsi" w:cstheme="majorHAnsi"/>
+          <w:b/>
+          <w:bCs/>
+          <w:color w:val="004F88"/>
+          <w:sz w:val="32"/>
+          <w:szCs w:val="32"/>
+          <w:u w:val="single"/>
+        </w:rPr>
+        <w:t>Void Functions</w:t>
       </w:r>
     </w:p>
     <w:p>
@@ -3016,7 +4063,7 @@
           <w:b/>
           <w:bCs/>
         </w:rPr>
-        <w:t>SetNewLine</w:t>
+        <w:t>ReadNextWord</w:t>
       </w:r>
       <w:proofErr w:type="spellEnd"/>
       <w:r>
@@ -3039,7 +4086,23 @@
           <w:b/>
           <w:bCs/>
         </w:rPr>
-        <w:t>void CharacterGCode(void)</w:t>
+        <w:t xml:space="preserve">void </w:t>
+      </w:r>
+      <w:proofErr w:type="spellStart"/>
+      <w:r>
+        <w:rPr>
+          <w:b/>
+          <w:bCs/>
+        </w:rPr>
+        <w:t>SetNewLine</w:t>
+      </w:r>
+      <w:proofErr w:type="spellEnd"/>
+      <w:r>
+        <w:rPr>
+          <w:b/>
+          <w:bCs/>
+        </w:rPr>
+        <w:t>(void)</w:t>
       </w:r>
     </w:p>
     <w:p>
@@ -3054,12 +4117,27 @@
           <w:b/>
           <w:bCs/>
         </w:rPr>
-        <w:t>void SetRobot(void)</w:t>
+        <w:t>void CharacterGCode(void)</w:t>
       </w:r>
     </w:p>
     <w:p>
       <w:pPr>
         <w:rPr>
+          <w:b/>
+          <w:bCs/>
+        </w:rPr>
+      </w:pPr>
+      <w:r>
+        <w:rPr>
+          <w:b/>
+          <w:bCs/>
+        </w:rPr>
+        <w:t>void SetRobot(void)</w:t>
+      </w:r>
+    </w:p>
+    <w:p>
+      <w:pPr>
+        <w:rPr>
           <w:color w:val="000000" w:themeColor="text1"/>
         </w:rPr>
       </w:pPr>
@@ -3097,7 +4175,19 @@
         <w:rPr>
           <w:color w:val="000000" w:themeColor="text1"/>
         </w:rPr>
-        <w:t xml:space="preserve"> are all void and therefore don’t output anything. However, I still need them because they call other functions and set the values of variables. This is done on repeat, meaning that having them makes my code run smoother and easier to read/edit.</w:t>
+        <w:t xml:space="preserve"> are all void and therefore don’t output anything. However, I still need them because they call other functions and set the values of variables. This is done on repeat, meaning that having them makes my code run smoother and </w:t>
+      </w:r>
+      <w:r>
+        <w:rPr>
+          <w:color w:val="000000" w:themeColor="text1"/>
+        </w:rPr>
+        <w:t xml:space="preserve">also make it </w:t>
+      </w:r>
+      <w:r>
+        <w:rPr>
+          <w:color w:val="000000" w:themeColor="text1"/>
+        </w:rPr>
+        <w:t>easier to read/edit.</w:t>
       </w:r>
     </w:p>
     <w:p>
@@ -3495,39 +4585,40 @@
       </w:pPr>
     </w:p>
     <w:p/>
+    <w:p/>
+    <w:p/>
+    <w:p/>
+    <w:p/>
+    <w:p/>
     <w:p>
       <w:pPr>
         <w:pStyle w:val="Heading1"/>
-        <w:jc w:val="center"/>
-        <w:rPr>
-          <w:b/>
-          <w:bCs/>
-          <w:sz w:val="36"/>
-          <w:szCs w:val="36"/>
-        </w:rPr>
-      </w:pPr>
-      <w:r>
-        <w:rPr>
-          <w:b/>
-          <w:bCs/>
-          <w:sz w:val="36"/>
-          <w:szCs w:val="36"/>
-        </w:rPr>
+        <w:rPr>
+          <w:b/>
+          <w:bCs/>
+          <w:u w:val="single"/>
+        </w:rPr>
+      </w:pPr>
+      <w:r>
+        <w:rPr>
+          <w:b/>
+          <w:bCs/>
+          <w:u w:val="single"/>
+        </w:rPr>
+        <w:lastRenderedPageBreak/>
         <w:t>Testing Information</w:t>
       </w:r>
       <w:r>
         <w:rPr>
           <w:b/>
           <w:bCs/>
-          <w:sz w:val="36"/>
-          <w:szCs w:val="36"/>
+          <w:u w:val="single"/>
         </w:rPr>
         <w:t>:</w:t>
       </w:r>
     </w:p>
     <w:p>
       <w:pPr>
-        <w:jc w:val="center"/>
         <w:rPr>
           <w:b/>
           <w:bCs/>
@@ -3549,7 +4640,6 @@
     </w:p>
     <w:p>
       <w:pPr>
-        <w:jc w:val="center"/>
         <w:rPr>
           <w:b/>
           <w:bCs/>
@@ -3829,7 +4919,6 @@
                 <w:sz w:val="16"/>
                 <w:szCs w:val="16"/>
               </w:rPr>
-              <w:lastRenderedPageBreak/>
               <w:t>Use the correct “SingleStrokeFont.txt” file containing all the right characters</w:t>
             </w:r>
           </w:p>
@@ -3957,7 +5046,6 @@
                 <w:sz w:val="16"/>
                 <w:szCs w:val="16"/>
               </w:rPr>
-              <w:lastRenderedPageBreak/>
               <w:t>FontArray</w:t>
             </w:r>
             <w:proofErr w:type="spellEnd"/>
@@ -4001,7 +5089,6 @@
                 <w:sz w:val="16"/>
                 <w:szCs w:val="16"/>
               </w:rPr>
-              <w:lastRenderedPageBreak/>
               <w:t>FP (file pointer) equals null, therefore user is told that “SingleStrokeFont.txt” couldn’t be found and the programme immediately ends</w:t>
             </w:r>
           </w:p>
@@ -4090,7 +5177,6 @@
                 <w:sz w:val="20"/>
                 <w:szCs w:val="18"/>
               </w:rPr>
-              <w:lastRenderedPageBreak/>
               <w:t>main()</w:t>
             </w:r>
           </w:p>
@@ -6033,8 +7119,19 @@
     <w:p>
       <w:pPr>
         <w:pStyle w:val="Heading1"/>
-      </w:pPr>
-      <w:r>
+        <w:rPr>
+          <w:b/>
+          <w:bCs/>
+          <w:u w:val="single"/>
+        </w:rPr>
+      </w:pPr>
+      <w:r>
+        <w:rPr>
+          <w:b/>
+          <w:bCs/>
+          <w:u w:val="single"/>
+        </w:rPr>
+        <w:lastRenderedPageBreak/>
         <w:t>AI Statement</w:t>
       </w:r>
     </w:p>
@@ -6045,7 +7142,6 @@
     <w:p>
       <w:pPr>
         <w:pStyle w:val="Heading1"/>
-        <w:jc w:val="center"/>
         <w:rPr>
           <w:b/>
           <w:bCs/>
@@ -6548,9 +7644,233 @@
 <file path=word/numbering.xml><?xml version="1.0" encoding="utf-8"?>
 <w:numbering xmlns:wpc="http://schemas.microsoft.com/office/word/2010/wordprocessingCanvas" xmlns:cx="http://schemas.microsoft.com/office/drawing/2014/chartex" xmlns:cx1="http://schemas.microsoft.com/office/drawing/2015/9/8/chartex" xmlns:cx2="http://schemas.microsoft.com/office/drawing/2015/10/21/chartex" xmlns:cx3="http://schemas.microsoft.com/office/drawing/2016/5/9/chartex" xmlns:cx4="http://schemas.microsoft.com/office/drawing/2016/5/10/chartex" xmlns:cx5="http://schemas.microsoft.com/office/drawing/2016/5/11/chartex" xmlns:cx6="http://schemas.microsoft.com/office/drawing/2016/5/12/chartex" xmlns:cx7="http://schemas.microsoft.com/office/drawing/2016/5/13/chartex" xmlns:cx8="http://schemas.microsoft.com/office/drawing/2016/5/14/chartex" xmlns:mc="http://schemas.openxmlformats.org/markup-compatibility/2006" xmlns:aink="http://schemas.microsoft.com/office/drawing/2016/ink" xmlns:am3d="http://schemas.microsoft.com/office/drawing/2017/model3d" xmlns:o="urn:schemas-microsoft-com:office:office" xmlns:oel="http://schemas.microsoft.com/office/2019/extlst" xmlns:r="http://schemas.openxmlformats.org/officeDocument/2006/relationships" xmlns:m="http://schemas.openxmlformats.org/officeDocument/2006/math" xmlns:v="urn:schemas-microsoft-com:vml" xmlns:wp14="http://schemas.microsoft.com/office/word/2010/wordprocessingDrawing" xmlns:wp="http://schemas.openxmlformats.org/drawingml/2006/wordprocessingDrawing" xmlns:w10="urn:schemas-microsoft-com:office:word" xmlns:w="http://schemas.openxmlformats.org/wordprocessingml/2006/main" xmlns:w14="http://schemas.microsoft.com/office/word/2010/wordml" xmlns:w15="http://schemas.microsoft.com/office/word/2012/wordml" xmlns:w16cex="http://schemas.microsoft.com/office/word/2018/wordml/cex" xmlns:w16cid="http://schemas.microsoft.com/office/word/2016/wordml/cid" xmlns:w16="http://schemas.microsoft.com/office/word/2018/wordml" xmlns:w16du="http://schemas.microsoft.com/office/word/2023/wordml/word16du" xmlns:w16sdtdh="http://schemas.microsoft.com/office/word/2020/wordml/sdtdatahash" xmlns:w16sdtfl="http://schemas.microsoft.com/office/word/2024/wordml/sdtformatlock" xmlns:w16se="http://schemas.microsoft.com/office/word/2015/wordml/symex" xmlns:wpg="http://schemas.microsoft.com/office/word/2010/wordprocessingGroup" xmlns:wpi="http://schemas.microsoft.com/office/word/2010/wordprocessingInk" xmlns:wne="http://schemas.microsoft.com/office/word/2006/wordml" xmlns:wps="http://schemas.microsoft.com/office/word/2010/wordprocessingShape" mc:Ignorable="w14 w15 w16se w16cid w16 w16cex w16sdtdh w16sdtfl w16du wp14">
   <w:abstractNum w:abstractNumId="0" w15:restartNumberingAfterBreak="0">
-    <w:nsid w:val="51A2058E"/>
+    <w:nsid w:val="00E751D2"/>
     <w:multiLevelType w:val="hybridMultilevel"/>
-    <w:tmpl w:val="D0025648"/>
+    <w:tmpl w:val="E200C322"/>
+    <w:lvl w:ilvl="0" w:tplc="7E5E429C">
+      <w:numFmt w:val="bullet"/>
+      <w:lvlText w:val="-"/>
+      <w:lvlJc w:val="left"/>
+      <w:pPr>
+        <w:ind w:left="1080" w:hanging="360"/>
+      </w:pPr>
+      <w:rPr>
+        <w:rFonts w:ascii="Calibri" w:eastAsiaTheme="minorEastAsia" w:hAnsi="Calibri" w:cs="Calibri" w:hint="default"/>
+      </w:rPr>
+    </w:lvl>
+    <w:lvl w:ilvl="1" w:tplc="08090003" w:tentative="1">
+      <w:start w:val="1"/>
+      <w:numFmt w:val="bullet"/>
+      <w:lvlText w:val="o"/>
+      <w:lvlJc w:val="left"/>
+      <w:pPr>
+        <w:ind w:left="1800" w:hanging="360"/>
+      </w:pPr>
+      <w:rPr>
+        <w:rFonts w:ascii="Courier New" w:hAnsi="Courier New" w:cs="Courier New" w:hint="default"/>
+      </w:rPr>
+    </w:lvl>
+    <w:lvl w:ilvl="2" w:tplc="08090005" w:tentative="1">
+      <w:start w:val="1"/>
+      <w:numFmt w:val="bullet"/>
+      <w:lvlText w:val=""/>
+      <w:lvlJc w:val="left"/>
+      <w:pPr>
+        <w:ind w:left="2520" w:hanging="360"/>
+      </w:pPr>
+      <w:rPr>
+        <w:rFonts w:ascii="Wingdings" w:hAnsi="Wingdings" w:hint="default"/>
+      </w:rPr>
+    </w:lvl>
+    <w:lvl w:ilvl="3" w:tplc="08090001" w:tentative="1">
+      <w:start w:val="1"/>
+      <w:numFmt w:val="bullet"/>
+      <w:lvlText w:val=""/>
+      <w:lvlJc w:val="left"/>
+      <w:pPr>
+        <w:ind w:left="3240" w:hanging="360"/>
+      </w:pPr>
+      <w:rPr>
+        <w:rFonts w:ascii="Symbol" w:hAnsi="Symbol" w:hint="default"/>
+      </w:rPr>
+    </w:lvl>
+    <w:lvl w:ilvl="4" w:tplc="08090003" w:tentative="1">
+      <w:start w:val="1"/>
+      <w:numFmt w:val="bullet"/>
+      <w:lvlText w:val="o"/>
+      <w:lvlJc w:val="left"/>
+      <w:pPr>
+        <w:ind w:left="3960" w:hanging="360"/>
+      </w:pPr>
+      <w:rPr>
+        <w:rFonts w:ascii="Courier New" w:hAnsi="Courier New" w:cs="Courier New" w:hint="default"/>
+      </w:rPr>
+    </w:lvl>
+    <w:lvl w:ilvl="5" w:tplc="08090005" w:tentative="1">
+      <w:start w:val="1"/>
+      <w:numFmt w:val="bullet"/>
+      <w:lvlText w:val=""/>
+      <w:lvlJc w:val="left"/>
+      <w:pPr>
+        <w:ind w:left="4680" w:hanging="360"/>
+      </w:pPr>
+      <w:rPr>
+        <w:rFonts w:ascii="Wingdings" w:hAnsi="Wingdings" w:hint="default"/>
+      </w:rPr>
+    </w:lvl>
+    <w:lvl w:ilvl="6" w:tplc="08090001" w:tentative="1">
+      <w:start w:val="1"/>
+      <w:numFmt w:val="bullet"/>
+      <w:lvlText w:val=""/>
+      <w:lvlJc w:val="left"/>
+      <w:pPr>
+        <w:ind w:left="5400" w:hanging="360"/>
+      </w:pPr>
+      <w:rPr>
+        <w:rFonts w:ascii="Symbol" w:hAnsi="Symbol" w:hint="default"/>
+      </w:rPr>
+    </w:lvl>
+    <w:lvl w:ilvl="7" w:tplc="08090003" w:tentative="1">
+      <w:start w:val="1"/>
+      <w:numFmt w:val="bullet"/>
+      <w:lvlText w:val="o"/>
+      <w:lvlJc w:val="left"/>
+      <w:pPr>
+        <w:ind w:left="6120" w:hanging="360"/>
+      </w:pPr>
+      <w:rPr>
+        <w:rFonts w:ascii="Courier New" w:hAnsi="Courier New" w:cs="Courier New" w:hint="default"/>
+      </w:rPr>
+    </w:lvl>
+    <w:lvl w:ilvl="8" w:tplc="08090005" w:tentative="1">
+      <w:start w:val="1"/>
+      <w:numFmt w:val="bullet"/>
+      <w:lvlText w:val=""/>
+      <w:lvlJc w:val="left"/>
+      <w:pPr>
+        <w:ind w:left="6840" w:hanging="360"/>
+      </w:pPr>
+      <w:rPr>
+        <w:rFonts w:ascii="Wingdings" w:hAnsi="Wingdings" w:hint="default"/>
+      </w:rPr>
+    </w:lvl>
+  </w:abstractNum>
+  <w:abstractNum w:abstractNumId="1" w15:restartNumberingAfterBreak="0">
+    <w:nsid w:val="159520A8"/>
+    <w:multiLevelType w:val="hybridMultilevel"/>
+    <w:tmpl w:val="EEC24C8A"/>
+    <w:lvl w:ilvl="0" w:tplc="45F40206">
+      <w:numFmt w:val="bullet"/>
+      <w:lvlText w:val="-"/>
+      <w:lvlJc w:val="left"/>
+      <w:pPr>
+        <w:ind w:left="1080" w:hanging="360"/>
+      </w:pPr>
+      <w:rPr>
+        <w:rFonts w:ascii="Calibri" w:eastAsiaTheme="minorEastAsia" w:hAnsi="Calibri" w:cs="Calibri" w:hint="default"/>
+      </w:rPr>
+    </w:lvl>
+    <w:lvl w:ilvl="1" w:tplc="08090003" w:tentative="1">
+      <w:start w:val="1"/>
+      <w:numFmt w:val="bullet"/>
+      <w:lvlText w:val="o"/>
+      <w:lvlJc w:val="left"/>
+      <w:pPr>
+        <w:ind w:left="1800" w:hanging="360"/>
+      </w:pPr>
+      <w:rPr>
+        <w:rFonts w:ascii="Courier New" w:hAnsi="Courier New" w:cs="Courier New" w:hint="default"/>
+      </w:rPr>
+    </w:lvl>
+    <w:lvl w:ilvl="2" w:tplc="08090005" w:tentative="1">
+      <w:start w:val="1"/>
+      <w:numFmt w:val="bullet"/>
+      <w:lvlText w:val=""/>
+      <w:lvlJc w:val="left"/>
+      <w:pPr>
+        <w:ind w:left="2520" w:hanging="360"/>
+      </w:pPr>
+      <w:rPr>
+        <w:rFonts w:ascii="Wingdings" w:hAnsi="Wingdings" w:hint="default"/>
+      </w:rPr>
+    </w:lvl>
+    <w:lvl w:ilvl="3" w:tplc="08090001" w:tentative="1">
+      <w:start w:val="1"/>
+      <w:numFmt w:val="bullet"/>
+      <w:lvlText w:val=""/>
+      <w:lvlJc w:val="left"/>
+      <w:pPr>
+        <w:ind w:left="3240" w:hanging="360"/>
+      </w:pPr>
+      <w:rPr>
+        <w:rFonts w:ascii="Symbol" w:hAnsi="Symbol" w:hint="default"/>
+      </w:rPr>
+    </w:lvl>
+    <w:lvl w:ilvl="4" w:tplc="08090003" w:tentative="1">
+      <w:start w:val="1"/>
+      <w:numFmt w:val="bullet"/>
+      <w:lvlText w:val="o"/>
+      <w:lvlJc w:val="left"/>
+      <w:pPr>
+        <w:ind w:left="3960" w:hanging="360"/>
+      </w:pPr>
+      <w:rPr>
+        <w:rFonts w:ascii="Courier New" w:hAnsi="Courier New" w:cs="Courier New" w:hint="default"/>
+      </w:rPr>
+    </w:lvl>
+    <w:lvl w:ilvl="5" w:tplc="08090005" w:tentative="1">
+      <w:start w:val="1"/>
+      <w:numFmt w:val="bullet"/>
+      <w:lvlText w:val=""/>
+      <w:lvlJc w:val="left"/>
+      <w:pPr>
+        <w:ind w:left="4680" w:hanging="360"/>
+      </w:pPr>
+      <w:rPr>
+        <w:rFonts w:ascii="Wingdings" w:hAnsi="Wingdings" w:hint="default"/>
+      </w:rPr>
+    </w:lvl>
+    <w:lvl w:ilvl="6" w:tplc="08090001" w:tentative="1">
+      <w:start w:val="1"/>
+      <w:numFmt w:val="bullet"/>
+      <w:lvlText w:val=""/>
+      <w:lvlJc w:val="left"/>
+      <w:pPr>
+        <w:ind w:left="5400" w:hanging="360"/>
+      </w:pPr>
+      <w:rPr>
+        <w:rFonts w:ascii="Symbol" w:hAnsi="Symbol" w:hint="default"/>
+      </w:rPr>
+    </w:lvl>
+    <w:lvl w:ilvl="7" w:tplc="08090003" w:tentative="1">
+      <w:start w:val="1"/>
+      <w:numFmt w:val="bullet"/>
+      <w:lvlText w:val="o"/>
+      <w:lvlJc w:val="left"/>
+      <w:pPr>
+        <w:ind w:left="6120" w:hanging="360"/>
+      </w:pPr>
+      <w:rPr>
+        <w:rFonts w:ascii="Courier New" w:hAnsi="Courier New" w:cs="Courier New" w:hint="default"/>
+      </w:rPr>
+    </w:lvl>
+    <w:lvl w:ilvl="8" w:tplc="08090005" w:tentative="1">
+      <w:start w:val="1"/>
+      <w:numFmt w:val="bullet"/>
+      <w:lvlText w:val=""/>
+      <w:lvlJc w:val="left"/>
+      <w:pPr>
+        <w:ind w:left="6840" w:hanging="360"/>
+      </w:pPr>
+      <w:rPr>
+        <w:rFonts w:ascii="Wingdings" w:hAnsi="Wingdings" w:hint="default"/>
+      </w:rPr>
+    </w:lvl>
+  </w:abstractNum>
+  <w:abstractNum w:abstractNumId="2" w15:restartNumberingAfterBreak="0">
+    <w:nsid w:val="32D42A8D"/>
+    <w:multiLevelType w:val="hybridMultilevel"/>
+    <w:tmpl w:val="1E74C8E2"/>
     <w:lvl w:ilvl="0" w:tplc="08090001">
       <w:start w:val="1"/>
       <w:numFmt w:val="bullet"/>
@@ -6660,17 +7980,17 @@
       </w:rPr>
     </w:lvl>
   </w:abstractNum>
-  <w:abstractNum w:abstractNumId="1" w15:restartNumberingAfterBreak="0">
-    <w:nsid w:val="52832099"/>
+  <w:abstractNum w:abstractNumId="3" w15:restartNumberingAfterBreak="0">
+    <w:nsid w:val="3A1037E3"/>
     <w:multiLevelType w:val="hybridMultilevel"/>
-    <w:tmpl w:val="7D324472"/>
+    <w:tmpl w:val="2CB8E104"/>
     <w:lvl w:ilvl="0" w:tplc="08090001">
       <w:start w:val="1"/>
       <w:numFmt w:val="bullet"/>
       <w:lvlText w:val=""/>
       <w:lvlJc w:val="left"/>
       <w:pPr>
-        <w:ind w:left="720" w:hanging="360"/>
+        <w:ind w:left="1080" w:hanging="360"/>
       </w:pPr>
       <w:rPr>
         <w:rFonts w:ascii="Symbol" w:hAnsi="Symbol" w:hint="default"/>
@@ -6773,11 +8093,712 @@
       </w:rPr>
     </w:lvl>
   </w:abstractNum>
+  <w:abstractNum w:abstractNumId="4" w15:restartNumberingAfterBreak="0">
+    <w:nsid w:val="3D1B727D"/>
+    <w:multiLevelType w:val="hybridMultilevel"/>
+    <w:tmpl w:val="EFDC810A"/>
+    <w:lvl w:ilvl="0" w:tplc="08090001">
+      <w:start w:val="1"/>
+      <w:numFmt w:val="bullet"/>
+      <w:lvlText w:val=""/>
+      <w:lvlJc w:val="left"/>
+      <w:pPr>
+        <w:ind w:left="720" w:hanging="360"/>
+      </w:pPr>
+      <w:rPr>
+        <w:rFonts w:ascii="Symbol" w:hAnsi="Symbol" w:hint="default"/>
+      </w:rPr>
+    </w:lvl>
+    <w:lvl w:ilvl="1" w:tplc="08090003" w:tentative="1">
+      <w:start w:val="1"/>
+      <w:numFmt w:val="bullet"/>
+      <w:lvlText w:val="o"/>
+      <w:lvlJc w:val="left"/>
+      <w:pPr>
+        <w:ind w:left="1440" w:hanging="360"/>
+      </w:pPr>
+      <w:rPr>
+        <w:rFonts w:ascii="Courier New" w:hAnsi="Courier New" w:cs="Courier New" w:hint="default"/>
+      </w:rPr>
+    </w:lvl>
+    <w:lvl w:ilvl="2" w:tplc="08090005" w:tentative="1">
+      <w:start w:val="1"/>
+      <w:numFmt w:val="bullet"/>
+      <w:lvlText w:val=""/>
+      <w:lvlJc w:val="left"/>
+      <w:pPr>
+        <w:ind w:left="2160" w:hanging="360"/>
+      </w:pPr>
+      <w:rPr>
+        <w:rFonts w:ascii="Wingdings" w:hAnsi="Wingdings" w:hint="default"/>
+      </w:rPr>
+    </w:lvl>
+    <w:lvl w:ilvl="3" w:tplc="08090001" w:tentative="1">
+      <w:start w:val="1"/>
+      <w:numFmt w:val="bullet"/>
+      <w:lvlText w:val=""/>
+      <w:lvlJc w:val="left"/>
+      <w:pPr>
+        <w:ind w:left="2880" w:hanging="360"/>
+      </w:pPr>
+      <w:rPr>
+        <w:rFonts w:ascii="Symbol" w:hAnsi="Symbol" w:hint="default"/>
+      </w:rPr>
+    </w:lvl>
+    <w:lvl w:ilvl="4" w:tplc="08090003" w:tentative="1">
+      <w:start w:val="1"/>
+      <w:numFmt w:val="bullet"/>
+      <w:lvlText w:val="o"/>
+      <w:lvlJc w:val="left"/>
+      <w:pPr>
+        <w:ind w:left="3600" w:hanging="360"/>
+      </w:pPr>
+      <w:rPr>
+        <w:rFonts w:ascii="Courier New" w:hAnsi="Courier New" w:cs="Courier New" w:hint="default"/>
+      </w:rPr>
+    </w:lvl>
+    <w:lvl w:ilvl="5" w:tplc="08090005" w:tentative="1">
+      <w:start w:val="1"/>
+      <w:numFmt w:val="bullet"/>
+      <w:lvlText w:val=""/>
+      <w:lvlJc w:val="left"/>
+      <w:pPr>
+        <w:ind w:left="4320" w:hanging="360"/>
+      </w:pPr>
+      <w:rPr>
+        <w:rFonts w:ascii="Wingdings" w:hAnsi="Wingdings" w:hint="default"/>
+      </w:rPr>
+    </w:lvl>
+    <w:lvl w:ilvl="6" w:tplc="08090001" w:tentative="1">
+      <w:start w:val="1"/>
+      <w:numFmt w:val="bullet"/>
+      <w:lvlText w:val=""/>
+      <w:lvlJc w:val="left"/>
+      <w:pPr>
+        <w:ind w:left="5040" w:hanging="360"/>
+      </w:pPr>
+      <w:rPr>
+        <w:rFonts w:ascii="Symbol" w:hAnsi="Symbol" w:hint="default"/>
+      </w:rPr>
+    </w:lvl>
+    <w:lvl w:ilvl="7" w:tplc="08090003" w:tentative="1">
+      <w:start w:val="1"/>
+      <w:numFmt w:val="bullet"/>
+      <w:lvlText w:val="o"/>
+      <w:lvlJc w:val="left"/>
+      <w:pPr>
+        <w:ind w:left="5760" w:hanging="360"/>
+      </w:pPr>
+      <w:rPr>
+        <w:rFonts w:ascii="Courier New" w:hAnsi="Courier New" w:cs="Courier New" w:hint="default"/>
+      </w:rPr>
+    </w:lvl>
+    <w:lvl w:ilvl="8" w:tplc="08090005" w:tentative="1">
+      <w:start w:val="1"/>
+      <w:numFmt w:val="bullet"/>
+      <w:lvlText w:val=""/>
+      <w:lvlJc w:val="left"/>
+      <w:pPr>
+        <w:ind w:left="6480" w:hanging="360"/>
+      </w:pPr>
+      <w:rPr>
+        <w:rFonts w:ascii="Wingdings" w:hAnsi="Wingdings" w:hint="default"/>
+      </w:rPr>
+    </w:lvl>
+  </w:abstractNum>
+  <w:abstractNum w:abstractNumId="5" w15:restartNumberingAfterBreak="0">
+    <w:nsid w:val="434F6A32"/>
+    <w:multiLevelType w:val="hybridMultilevel"/>
+    <w:tmpl w:val="B96CFF88"/>
+    <w:lvl w:ilvl="0" w:tplc="7E5E429C">
+      <w:numFmt w:val="bullet"/>
+      <w:lvlText w:val="-"/>
+      <w:lvlJc w:val="left"/>
+      <w:pPr>
+        <w:ind w:left="1080" w:hanging="360"/>
+      </w:pPr>
+      <w:rPr>
+        <w:rFonts w:ascii="Calibri" w:eastAsiaTheme="minorEastAsia" w:hAnsi="Calibri" w:cs="Calibri" w:hint="default"/>
+      </w:rPr>
+    </w:lvl>
+    <w:lvl w:ilvl="1" w:tplc="08090003" w:tentative="1">
+      <w:start w:val="1"/>
+      <w:numFmt w:val="bullet"/>
+      <w:lvlText w:val="o"/>
+      <w:lvlJc w:val="left"/>
+      <w:pPr>
+        <w:ind w:left="1440" w:hanging="360"/>
+      </w:pPr>
+      <w:rPr>
+        <w:rFonts w:ascii="Courier New" w:hAnsi="Courier New" w:cs="Courier New" w:hint="default"/>
+      </w:rPr>
+    </w:lvl>
+    <w:lvl w:ilvl="2" w:tplc="08090005" w:tentative="1">
+      <w:start w:val="1"/>
+      <w:numFmt w:val="bullet"/>
+      <w:lvlText w:val=""/>
+      <w:lvlJc w:val="left"/>
+      <w:pPr>
+        <w:ind w:left="2160" w:hanging="360"/>
+      </w:pPr>
+      <w:rPr>
+        <w:rFonts w:ascii="Wingdings" w:hAnsi="Wingdings" w:hint="default"/>
+      </w:rPr>
+    </w:lvl>
+    <w:lvl w:ilvl="3" w:tplc="08090001" w:tentative="1">
+      <w:start w:val="1"/>
+      <w:numFmt w:val="bullet"/>
+      <w:lvlText w:val=""/>
+      <w:lvlJc w:val="left"/>
+      <w:pPr>
+        <w:ind w:left="2880" w:hanging="360"/>
+      </w:pPr>
+      <w:rPr>
+        <w:rFonts w:ascii="Symbol" w:hAnsi="Symbol" w:hint="default"/>
+      </w:rPr>
+    </w:lvl>
+    <w:lvl w:ilvl="4" w:tplc="08090003" w:tentative="1">
+      <w:start w:val="1"/>
+      <w:numFmt w:val="bullet"/>
+      <w:lvlText w:val="o"/>
+      <w:lvlJc w:val="left"/>
+      <w:pPr>
+        <w:ind w:left="3600" w:hanging="360"/>
+      </w:pPr>
+      <w:rPr>
+        <w:rFonts w:ascii="Courier New" w:hAnsi="Courier New" w:cs="Courier New" w:hint="default"/>
+      </w:rPr>
+    </w:lvl>
+    <w:lvl w:ilvl="5" w:tplc="08090005" w:tentative="1">
+      <w:start w:val="1"/>
+      <w:numFmt w:val="bullet"/>
+      <w:lvlText w:val=""/>
+      <w:lvlJc w:val="left"/>
+      <w:pPr>
+        <w:ind w:left="4320" w:hanging="360"/>
+      </w:pPr>
+      <w:rPr>
+        <w:rFonts w:ascii="Wingdings" w:hAnsi="Wingdings" w:hint="default"/>
+      </w:rPr>
+    </w:lvl>
+    <w:lvl w:ilvl="6" w:tplc="08090001" w:tentative="1">
+      <w:start w:val="1"/>
+      <w:numFmt w:val="bullet"/>
+      <w:lvlText w:val=""/>
+      <w:lvlJc w:val="left"/>
+      <w:pPr>
+        <w:ind w:left="5040" w:hanging="360"/>
+      </w:pPr>
+      <w:rPr>
+        <w:rFonts w:ascii="Symbol" w:hAnsi="Symbol" w:hint="default"/>
+      </w:rPr>
+    </w:lvl>
+    <w:lvl w:ilvl="7" w:tplc="08090003" w:tentative="1">
+      <w:start w:val="1"/>
+      <w:numFmt w:val="bullet"/>
+      <w:lvlText w:val="o"/>
+      <w:lvlJc w:val="left"/>
+      <w:pPr>
+        <w:ind w:left="5760" w:hanging="360"/>
+      </w:pPr>
+      <w:rPr>
+        <w:rFonts w:ascii="Courier New" w:hAnsi="Courier New" w:cs="Courier New" w:hint="default"/>
+      </w:rPr>
+    </w:lvl>
+    <w:lvl w:ilvl="8" w:tplc="08090005" w:tentative="1">
+      <w:start w:val="1"/>
+      <w:numFmt w:val="bullet"/>
+      <w:lvlText w:val=""/>
+      <w:lvlJc w:val="left"/>
+      <w:pPr>
+        <w:ind w:left="6480" w:hanging="360"/>
+      </w:pPr>
+      <w:rPr>
+        <w:rFonts w:ascii="Wingdings" w:hAnsi="Wingdings" w:hint="default"/>
+      </w:rPr>
+    </w:lvl>
+  </w:abstractNum>
+  <w:abstractNum w:abstractNumId="6" w15:restartNumberingAfterBreak="0">
+    <w:nsid w:val="51A2058E"/>
+    <w:multiLevelType w:val="hybridMultilevel"/>
+    <w:tmpl w:val="D0025648"/>
+    <w:lvl w:ilvl="0" w:tplc="08090001">
+      <w:start w:val="1"/>
+      <w:numFmt w:val="bullet"/>
+      <w:lvlText w:val=""/>
+      <w:lvlJc w:val="left"/>
+      <w:pPr>
+        <w:ind w:left="720" w:hanging="360"/>
+      </w:pPr>
+      <w:rPr>
+        <w:rFonts w:ascii="Symbol" w:hAnsi="Symbol" w:hint="default"/>
+      </w:rPr>
+    </w:lvl>
+    <w:lvl w:ilvl="1" w:tplc="08090003" w:tentative="1">
+      <w:start w:val="1"/>
+      <w:numFmt w:val="bullet"/>
+      <w:lvlText w:val="o"/>
+      <w:lvlJc w:val="left"/>
+      <w:pPr>
+        <w:ind w:left="1440" w:hanging="360"/>
+      </w:pPr>
+      <w:rPr>
+        <w:rFonts w:ascii="Courier New" w:hAnsi="Courier New" w:cs="Courier New" w:hint="default"/>
+      </w:rPr>
+    </w:lvl>
+    <w:lvl w:ilvl="2" w:tplc="08090005" w:tentative="1">
+      <w:start w:val="1"/>
+      <w:numFmt w:val="bullet"/>
+      <w:lvlText w:val=""/>
+      <w:lvlJc w:val="left"/>
+      <w:pPr>
+        <w:ind w:left="2160" w:hanging="360"/>
+      </w:pPr>
+      <w:rPr>
+        <w:rFonts w:ascii="Wingdings" w:hAnsi="Wingdings" w:hint="default"/>
+      </w:rPr>
+    </w:lvl>
+    <w:lvl w:ilvl="3" w:tplc="08090001" w:tentative="1">
+      <w:start w:val="1"/>
+      <w:numFmt w:val="bullet"/>
+      <w:lvlText w:val=""/>
+      <w:lvlJc w:val="left"/>
+      <w:pPr>
+        <w:ind w:left="2880" w:hanging="360"/>
+      </w:pPr>
+      <w:rPr>
+        <w:rFonts w:ascii="Symbol" w:hAnsi="Symbol" w:hint="default"/>
+      </w:rPr>
+    </w:lvl>
+    <w:lvl w:ilvl="4" w:tplc="08090003" w:tentative="1">
+      <w:start w:val="1"/>
+      <w:numFmt w:val="bullet"/>
+      <w:lvlText w:val="o"/>
+      <w:lvlJc w:val="left"/>
+      <w:pPr>
+        <w:ind w:left="3600" w:hanging="360"/>
+      </w:pPr>
+      <w:rPr>
+        <w:rFonts w:ascii="Courier New" w:hAnsi="Courier New" w:cs="Courier New" w:hint="default"/>
+      </w:rPr>
+    </w:lvl>
+    <w:lvl w:ilvl="5" w:tplc="08090005" w:tentative="1">
+      <w:start w:val="1"/>
+      <w:numFmt w:val="bullet"/>
+      <w:lvlText w:val=""/>
+      <w:lvlJc w:val="left"/>
+      <w:pPr>
+        <w:ind w:left="4320" w:hanging="360"/>
+      </w:pPr>
+      <w:rPr>
+        <w:rFonts w:ascii="Wingdings" w:hAnsi="Wingdings" w:hint="default"/>
+      </w:rPr>
+    </w:lvl>
+    <w:lvl w:ilvl="6" w:tplc="08090001" w:tentative="1">
+      <w:start w:val="1"/>
+      <w:numFmt w:val="bullet"/>
+      <w:lvlText w:val=""/>
+      <w:lvlJc w:val="left"/>
+      <w:pPr>
+        <w:ind w:left="5040" w:hanging="360"/>
+      </w:pPr>
+      <w:rPr>
+        <w:rFonts w:ascii="Symbol" w:hAnsi="Symbol" w:hint="default"/>
+      </w:rPr>
+    </w:lvl>
+    <w:lvl w:ilvl="7" w:tplc="08090003" w:tentative="1">
+      <w:start w:val="1"/>
+      <w:numFmt w:val="bullet"/>
+      <w:lvlText w:val="o"/>
+      <w:lvlJc w:val="left"/>
+      <w:pPr>
+        <w:ind w:left="5760" w:hanging="360"/>
+      </w:pPr>
+      <w:rPr>
+        <w:rFonts w:ascii="Courier New" w:hAnsi="Courier New" w:cs="Courier New" w:hint="default"/>
+      </w:rPr>
+    </w:lvl>
+    <w:lvl w:ilvl="8" w:tplc="08090005" w:tentative="1">
+      <w:start w:val="1"/>
+      <w:numFmt w:val="bullet"/>
+      <w:lvlText w:val=""/>
+      <w:lvlJc w:val="left"/>
+      <w:pPr>
+        <w:ind w:left="6480" w:hanging="360"/>
+      </w:pPr>
+      <w:rPr>
+        <w:rFonts w:ascii="Wingdings" w:hAnsi="Wingdings" w:hint="default"/>
+      </w:rPr>
+    </w:lvl>
+  </w:abstractNum>
+  <w:abstractNum w:abstractNumId="7" w15:restartNumberingAfterBreak="0">
+    <w:nsid w:val="52832099"/>
+    <w:multiLevelType w:val="hybridMultilevel"/>
+    <w:tmpl w:val="7D324472"/>
+    <w:lvl w:ilvl="0" w:tplc="08090001">
+      <w:start w:val="1"/>
+      <w:numFmt w:val="bullet"/>
+      <w:lvlText w:val=""/>
+      <w:lvlJc w:val="left"/>
+      <w:pPr>
+        <w:ind w:left="720" w:hanging="360"/>
+      </w:pPr>
+      <w:rPr>
+        <w:rFonts w:ascii="Symbol" w:hAnsi="Symbol" w:hint="default"/>
+      </w:rPr>
+    </w:lvl>
+    <w:lvl w:ilvl="1" w:tplc="08090003" w:tentative="1">
+      <w:start w:val="1"/>
+      <w:numFmt w:val="bullet"/>
+      <w:lvlText w:val="o"/>
+      <w:lvlJc w:val="left"/>
+      <w:pPr>
+        <w:ind w:left="1440" w:hanging="360"/>
+      </w:pPr>
+      <w:rPr>
+        <w:rFonts w:ascii="Courier New" w:hAnsi="Courier New" w:cs="Courier New" w:hint="default"/>
+      </w:rPr>
+    </w:lvl>
+    <w:lvl w:ilvl="2" w:tplc="08090005" w:tentative="1">
+      <w:start w:val="1"/>
+      <w:numFmt w:val="bullet"/>
+      <w:lvlText w:val=""/>
+      <w:lvlJc w:val="left"/>
+      <w:pPr>
+        <w:ind w:left="2160" w:hanging="360"/>
+      </w:pPr>
+      <w:rPr>
+        <w:rFonts w:ascii="Wingdings" w:hAnsi="Wingdings" w:hint="default"/>
+      </w:rPr>
+    </w:lvl>
+    <w:lvl w:ilvl="3" w:tplc="08090001" w:tentative="1">
+      <w:start w:val="1"/>
+      <w:numFmt w:val="bullet"/>
+      <w:lvlText w:val=""/>
+      <w:lvlJc w:val="left"/>
+      <w:pPr>
+        <w:ind w:left="2880" w:hanging="360"/>
+      </w:pPr>
+      <w:rPr>
+        <w:rFonts w:ascii="Symbol" w:hAnsi="Symbol" w:hint="default"/>
+      </w:rPr>
+    </w:lvl>
+    <w:lvl w:ilvl="4" w:tplc="08090003" w:tentative="1">
+      <w:start w:val="1"/>
+      <w:numFmt w:val="bullet"/>
+      <w:lvlText w:val="o"/>
+      <w:lvlJc w:val="left"/>
+      <w:pPr>
+        <w:ind w:left="3600" w:hanging="360"/>
+      </w:pPr>
+      <w:rPr>
+        <w:rFonts w:ascii="Courier New" w:hAnsi="Courier New" w:cs="Courier New" w:hint="default"/>
+      </w:rPr>
+    </w:lvl>
+    <w:lvl w:ilvl="5" w:tplc="08090005" w:tentative="1">
+      <w:start w:val="1"/>
+      <w:numFmt w:val="bullet"/>
+      <w:lvlText w:val=""/>
+      <w:lvlJc w:val="left"/>
+      <w:pPr>
+        <w:ind w:left="4320" w:hanging="360"/>
+      </w:pPr>
+      <w:rPr>
+        <w:rFonts w:ascii="Wingdings" w:hAnsi="Wingdings" w:hint="default"/>
+      </w:rPr>
+    </w:lvl>
+    <w:lvl w:ilvl="6" w:tplc="08090001" w:tentative="1">
+      <w:start w:val="1"/>
+      <w:numFmt w:val="bullet"/>
+      <w:lvlText w:val=""/>
+      <w:lvlJc w:val="left"/>
+      <w:pPr>
+        <w:ind w:left="5040" w:hanging="360"/>
+      </w:pPr>
+      <w:rPr>
+        <w:rFonts w:ascii="Symbol" w:hAnsi="Symbol" w:hint="default"/>
+      </w:rPr>
+    </w:lvl>
+    <w:lvl w:ilvl="7" w:tplc="08090003" w:tentative="1">
+      <w:start w:val="1"/>
+      <w:numFmt w:val="bullet"/>
+      <w:lvlText w:val="o"/>
+      <w:lvlJc w:val="left"/>
+      <w:pPr>
+        <w:ind w:left="5760" w:hanging="360"/>
+      </w:pPr>
+      <w:rPr>
+        <w:rFonts w:ascii="Courier New" w:hAnsi="Courier New" w:cs="Courier New" w:hint="default"/>
+      </w:rPr>
+    </w:lvl>
+    <w:lvl w:ilvl="8" w:tplc="08090005" w:tentative="1">
+      <w:start w:val="1"/>
+      <w:numFmt w:val="bullet"/>
+      <w:lvlText w:val=""/>
+      <w:lvlJc w:val="left"/>
+      <w:pPr>
+        <w:ind w:left="6480" w:hanging="360"/>
+      </w:pPr>
+      <w:rPr>
+        <w:rFonts w:ascii="Wingdings" w:hAnsi="Wingdings" w:hint="default"/>
+      </w:rPr>
+    </w:lvl>
+  </w:abstractNum>
+  <w:abstractNum w:abstractNumId="8" w15:restartNumberingAfterBreak="0">
+    <w:nsid w:val="5BBC0A88"/>
+    <w:multiLevelType w:val="hybridMultilevel"/>
+    <w:tmpl w:val="6F6E2DB8"/>
+    <w:lvl w:ilvl="0" w:tplc="08090001">
+      <w:start w:val="1"/>
+      <w:numFmt w:val="bullet"/>
+      <w:lvlText w:val=""/>
+      <w:lvlJc w:val="left"/>
+      <w:pPr>
+        <w:ind w:left="720" w:hanging="360"/>
+      </w:pPr>
+      <w:rPr>
+        <w:rFonts w:ascii="Symbol" w:hAnsi="Symbol" w:hint="default"/>
+      </w:rPr>
+    </w:lvl>
+    <w:lvl w:ilvl="1" w:tplc="08090003" w:tentative="1">
+      <w:start w:val="1"/>
+      <w:numFmt w:val="bullet"/>
+      <w:lvlText w:val="o"/>
+      <w:lvlJc w:val="left"/>
+      <w:pPr>
+        <w:ind w:left="1440" w:hanging="360"/>
+      </w:pPr>
+      <w:rPr>
+        <w:rFonts w:ascii="Courier New" w:hAnsi="Courier New" w:cs="Courier New" w:hint="default"/>
+      </w:rPr>
+    </w:lvl>
+    <w:lvl w:ilvl="2" w:tplc="08090005" w:tentative="1">
+      <w:start w:val="1"/>
+      <w:numFmt w:val="bullet"/>
+      <w:lvlText w:val=""/>
+      <w:lvlJc w:val="left"/>
+      <w:pPr>
+        <w:ind w:left="2160" w:hanging="360"/>
+      </w:pPr>
+      <w:rPr>
+        <w:rFonts w:ascii="Wingdings" w:hAnsi="Wingdings" w:hint="default"/>
+      </w:rPr>
+    </w:lvl>
+    <w:lvl w:ilvl="3" w:tplc="08090001" w:tentative="1">
+      <w:start w:val="1"/>
+      <w:numFmt w:val="bullet"/>
+      <w:lvlText w:val=""/>
+      <w:lvlJc w:val="left"/>
+      <w:pPr>
+        <w:ind w:left="2880" w:hanging="360"/>
+      </w:pPr>
+      <w:rPr>
+        <w:rFonts w:ascii="Symbol" w:hAnsi="Symbol" w:hint="default"/>
+      </w:rPr>
+    </w:lvl>
+    <w:lvl w:ilvl="4" w:tplc="08090003" w:tentative="1">
+      <w:start w:val="1"/>
+      <w:numFmt w:val="bullet"/>
+      <w:lvlText w:val="o"/>
+      <w:lvlJc w:val="left"/>
+      <w:pPr>
+        <w:ind w:left="3600" w:hanging="360"/>
+      </w:pPr>
+      <w:rPr>
+        <w:rFonts w:ascii="Courier New" w:hAnsi="Courier New" w:cs="Courier New" w:hint="default"/>
+      </w:rPr>
+    </w:lvl>
+    <w:lvl w:ilvl="5" w:tplc="08090005" w:tentative="1">
+      <w:start w:val="1"/>
+      <w:numFmt w:val="bullet"/>
+      <w:lvlText w:val=""/>
+      <w:lvlJc w:val="left"/>
+      <w:pPr>
+        <w:ind w:left="4320" w:hanging="360"/>
+      </w:pPr>
+      <w:rPr>
+        <w:rFonts w:ascii="Wingdings" w:hAnsi="Wingdings" w:hint="default"/>
+      </w:rPr>
+    </w:lvl>
+    <w:lvl w:ilvl="6" w:tplc="08090001" w:tentative="1">
+      <w:start w:val="1"/>
+      <w:numFmt w:val="bullet"/>
+      <w:lvlText w:val=""/>
+      <w:lvlJc w:val="left"/>
+      <w:pPr>
+        <w:ind w:left="5040" w:hanging="360"/>
+      </w:pPr>
+      <w:rPr>
+        <w:rFonts w:ascii="Symbol" w:hAnsi="Symbol" w:hint="default"/>
+      </w:rPr>
+    </w:lvl>
+    <w:lvl w:ilvl="7" w:tplc="08090003" w:tentative="1">
+      <w:start w:val="1"/>
+      <w:numFmt w:val="bullet"/>
+      <w:lvlText w:val="o"/>
+      <w:lvlJc w:val="left"/>
+      <w:pPr>
+        <w:ind w:left="5760" w:hanging="360"/>
+      </w:pPr>
+      <w:rPr>
+        <w:rFonts w:ascii="Courier New" w:hAnsi="Courier New" w:cs="Courier New" w:hint="default"/>
+      </w:rPr>
+    </w:lvl>
+    <w:lvl w:ilvl="8" w:tplc="08090005" w:tentative="1">
+      <w:start w:val="1"/>
+      <w:numFmt w:val="bullet"/>
+      <w:lvlText w:val=""/>
+      <w:lvlJc w:val="left"/>
+      <w:pPr>
+        <w:ind w:left="6480" w:hanging="360"/>
+      </w:pPr>
+      <w:rPr>
+        <w:rFonts w:ascii="Wingdings" w:hAnsi="Wingdings" w:hint="default"/>
+      </w:rPr>
+    </w:lvl>
+  </w:abstractNum>
+  <w:abstractNum w:abstractNumId="9" w15:restartNumberingAfterBreak="0">
+    <w:nsid w:val="7D3A7CB0"/>
+    <w:multiLevelType w:val="hybridMultilevel"/>
+    <w:tmpl w:val="5A783768"/>
+    <w:lvl w:ilvl="0" w:tplc="08090001">
+      <w:start w:val="1"/>
+      <w:numFmt w:val="bullet"/>
+      <w:lvlText w:val=""/>
+      <w:lvlJc w:val="left"/>
+      <w:pPr>
+        <w:ind w:left="720" w:hanging="360"/>
+      </w:pPr>
+      <w:rPr>
+        <w:rFonts w:ascii="Symbol" w:hAnsi="Symbol" w:hint="default"/>
+      </w:rPr>
+    </w:lvl>
+    <w:lvl w:ilvl="1" w:tplc="08090003" w:tentative="1">
+      <w:start w:val="1"/>
+      <w:numFmt w:val="bullet"/>
+      <w:lvlText w:val="o"/>
+      <w:lvlJc w:val="left"/>
+      <w:pPr>
+        <w:ind w:left="1440" w:hanging="360"/>
+      </w:pPr>
+      <w:rPr>
+        <w:rFonts w:ascii="Courier New" w:hAnsi="Courier New" w:cs="Courier New" w:hint="default"/>
+      </w:rPr>
+    </w:lvl>
+    <w:lvl w:ilvl="2" w:tplc="08090005" w:tentative="1">
+      <w:start w:val="1"/>
+      <w:numFmt w:val="bullet"/>
+      <w:lvlText w:val=""/>
+      <w:lvlJc w:val="left"/>
+      <w:pPr>
+        <w:ind w:left="2160" w:hanging="360"/>
+      </w:pPr>
+      <w:rPr>
+        <w:rFonts w:ascii="Wingdings" w:hAnsi="Wingdings" w:hint="default"/>
+      </w:rPr>
+    </w:lvl>
+    <w:lvl w:ilvl="3" w:tplc="08090001" w:tentative="1">
+      <w:start w:val="1"/>
+      <w:numFmt w:val="bullet"/>
+      <w:lvlText w:val=""/>
+      <w:lvlJc w:val="left"/>
+      <w:pPr>
+        <w:ind w:left="2880" w:hanging="360"/>
+      </w:pPr>
+      <w:rPr>
+        <w:rFonts w:ascii="Symbol" w:hAnsi="Symbol" w:hint="default"/>
+      </w:rPr>
+    </w:lvl>
+    <w:lvl w:ilvl="4" w:tplc="08090003" w:tentative="1">
+      <w:start w:val="1"/>
+      <w:numFmt w:val="bullet"/>
+      <w:lvlText w:val="o"/>
+      <w:lvlJc w:val="left"/>
+      <w:pPr>
+        <w:ind w:left="3600" w:hanging="360"/>
+      </w:pPr>
+      <w:rPr>
+        <w:rFonts w:ascii="Courier New" w:hAnsi="Courier New" w:cs="Courier New" w:hint="default"/>
+      </w:rPr>
+    </w:lvl>
+    <w:lvl w:ilvl="5" w:tplc="08090005" w:tentative="1">
+      <w:start w:val="1"/>
+      <w:numFmt w:val="bullet"/>
+      <w:lvlText w:val=""/>
+      <w:lvlJc w:val="left"/>
+      <w:pPr>
+        <w:ind w:left="4320" w:hanging="360"/>
+      </w:pPr>
+      <w:rPr>
+        <w:rFonts w:ascii="Wingdings" w:hAnsi="Wingdings" w:hint="default"/>
+      </w:rPr>
+    </w:lvl>
+    <w:lvl w:ilvl="6" w:tplc="08090001" w:tentative="1">
+      <w:start w:val="1"/>
+      <w:numFmt w:val="bullet"/>
+      <w:lvlText w:val=""/>
+      <w:lvlJc w:val="left"/>
+      <w:pPr>
+        <w:ind w:left="5040" w:hanging="360"/>
+      </w:pPr>
+      <w:rPr>
+        <w:rFonts w:ascii="Symbol" w:hAnsi="Symbol" w:hint="default"/>
+      </w:rPr>
+    </w:lvl>
+    <w:lvl w:ilvl="7" w:tplc="08090003" w:tentative="1">
+      <w:start w:val="1"/>
+      <w:numFmt w:val="bullet"/>
+      <w:lvlText w:val="o"/>
+      <w:lvlJc w:val="left"/>
+      <w:pPr>
+        <w:ind w:left="5760" w:hanging="360"/>
+      </w:pPr>
+      <w:rPr>
+        <w:rFonts w:ascii="Courier New" w:hAnsi="Courier New" w:cs="Courier New" w:hint="default"/>
+      </w:rPr>
+    </w:lvl>
+    <w:lvl w:ilvl="8" w:tplc="08090005" w:tentative="1">
+      <w:start w:val="1"/>
+      <w:numFmt w:val="bullet"/>
+      <w:lvlText w:val=""/>
+      <w:lvlJc w:val="left"/>
+      <w:pPr>
+        <w:ind w:left="6480" w:hanging="360"/>
+      </w:pPr>
+      <w:rPr>
+        <w:rFonts w:ascii="Wingdings" w:hAnsi="Wingdings" w:hint="default"/>
+      </w:rPr>
+    </w:lvl>
+  </w:abstractNum>
   <w:num w:numId="1" w16cid:durableId="2012485668">
+    <w:abstractNumId w:val="7"/>
+  </w:num>
+  <w:num w:numId="2" w16cid:durableId="1797213224">
+    <w:abstractNumId w:val="6"/>
+  </w:num>
+  <w:num w:numId="3" w16cid:durableId="1920410061">
+    <w:abstractNumId w:val="8"/>
+  </w:num>
+  <w:num w:numId="4" w16cid:durableId="1234659763">
+    <w:abstractNumId w:val="4"/>
+  </w:num>
+  <w:num w:numId="5" w16cid:durableId="1745183833">
+    <w:abstractNumId w:val="9"/>
+  </w:num>
+  <w:num w:numId="6" w16cid:durableId="899512242">
+    <w:abstractNumId w:val="2"/>
+  </w:num>
+  <w:num w:numId="7" w16cid:durableId="383529160">
     <w:abstractNumId w:val="1"/>
   </w:num>
-  <w:num w:numId="2" w16cid:durableId="1797213224">
+  <w:num w:numId="8" w16cid:durableId="522670697">
     <w:abstractNumId w:val="0"/>
+  </w:num>
+  <w:num w:numId="9" w16cid:durableId="1509951576">
+    <w:abstractNumId w:val="5"/>
+  </w:num>
+  <w:num w:numId="10" w16cid:durableId="1470979262">
+    <w:abstractNumId w:val="3"/>
   </w:num>
 </w:numbering>
 </file>

</xml_diff>